<commit_message>
Pequenos ajustes na documentação
</commit_message>
<xml_diff>
--- a/Documentação/Entrega1_Vestuario.docx
+++ b/Documentação/Entrega1_Vestuario.docx
@@ -96,12 +96,6 @@
         <w:gridCol w:w="6838"/>
       </w:tblGrid>
       <w:tr>
-        <w:tblPrEx>
-          <w:tblCellMar>
-            <w:top w:w="0" w:type="dxa"/>
-            <w:bottom w:w="0" w:type="dxa"/>
-          </w:tblCellMar>
-        </w:tblPrEx>
         <w:trPr>
           <w:cantSplit/>
           <w:tblHeader/>
@@ -172,12 +166,6 @@
         </w:tc>
       </w:tr>
       <w:tr>
-        <w:tblPrEx>
-          <w:tblCellMar>
-            <w:top w:w="0" w:type="dxa"/>
-            <w:bottom w:w="0" w:type="dxa"/>
-          </w:tblCellMar>
-        </w:tblPrEx>
         <w:trPr>
           <w:cantSplit/>
         </w:trPr>
@@ -233,12 +221,6 @@
         </w:tc>
       </w:tr>
       <w:tr>
-        <w:tblPrEx>
-          <w:tblCellMar>
-            <w:top w:w="0" w:type="dxa"/>
-            <w:bottom w:w="0" w:type="dxa"/>
-          </w:tblCellMar>
-        </w:tblPrEx>
         <w:trPr>
           <w:cantSplit/>
         </w:trPr>
@@ -294,12 +276,6 @@
         </w:tc>
       </w:tr>
       <w:tr>
-        <w:tblPrEx>
-          <w:tblCellMar>
-            <w:top w:w="0" w:type="dxa"/>
-            <w:bottom w:w="0" w:type="dxa"/>
-          </w:tblCellMar>
-        </w:tblPrEx>
         <w:trPr>
           <w:cantSplit/>
         </w:trPr>
@@ -355,12 +331,6 @@
         </w:tc>
       </w:tr>
       <w:tr>
-        <w:tblPrEx>
-          <w:tblCellMar>
-            <w:top w:w="0" w:type="dxa"/>
-            <w:bottom w:w="0" w:type="dxa"/>
-          </w:tblCellMar>
-        </w:tblPrEx>
         <w:trPr>
           <w:cantSplit/>
         </w:trPr>
@@ -416,12 +386,6 @@
         </w:tc>
       </w:tr>
       <w:tr>
-        <w:tblPrEx>
-          <w:tblCellMar>
-            <w:top w:w="0" w:type="dxa"/>
-            <w:bottom w:w="0" w:type="dxa"/>
-          </w:tblCellMar>
-        </w:tblPrEx>
         <w:trPr>
           <w:cantSplit/>
         </w:trPr>
@@ -568,12 +532,6 @@
         <w:gridCol w:w="3761"/>
       </w:tblGrid>
       <w:tr>
-        <w:tblPrEx>
-          <w:tblCellMar>
-            <w:top w:w="0" w:type="dxa"/>
-            <w:bottom w:w="0" w:type="dxa"/>
-          </w:tblCellMar>
-        </w:tblPrEx>
         <w:trPr>
           <w:cantSplit/>
           <w:tblHeader/>
@@ -740,12 +698,6 @@
         </w:tc>
       </w:tr>
       <w:tr>
-        <w:tblPrEx>
-          <w:tblCellMar>
-            <w:top w:w="0" w:type="dxa"/>
-            <w:bottom w:w="0" w:type="dxa"/>
-          </w:tblCellMar>
-        </w:tblPrEx>
         <w:trPr>
           <w:cantSplit/>
         </w:trPr>
@@ -876,12 +828,6 @@
         </w:tc>
       </w:tr>
       <w:tr>
-        <w:tblPrEx>
-          <w:tblCellMar>
-            <w:top w:w="0" w:type="dxa"/>
-            <w:bottom w:w="0" w:type="dxa"/>
-          </w:tblCellMar>
-        </w:tblPrEx>
         <w:trPr>
           <w:cantSplit/>
         </w:trPr>
@@ -1012,12 +958,6 @@
         </w:tc>
       </w:tr>
       <w:tr>
-        <w:tblPrEx>
-          <w:tblCellMar>
-            <w:top w:w="0" w:type="dxa"/>
-            <w:bottom w:w="0" w:type="dxa"/>
-          </w:tblCellMar>
-        </w:tblPrEx>
         <w:trPr>
           <w:cantSplit/>
         </w:trPr>
@@ -1148,12 +1088,6 @@
         </w:tc>
       </w:tr>
       <w:tr>
-        <w:tblPrEx>
-          <w:tblCellMar>
-            <w:top w:w="0" w:type="dxa"/>
-            <w:bottom w:w="0" w:type="dxa"/>
-          </w:tblCellMar>
-        </w:tblPrEx>
         <w:trPr>
           <w:cantSplit/>
         </w:trPr>
@@ -1284,12 +1218,6 @@
         </w:tc>
       </w:tr>
       <w:tr>
-        <w:tblPrEx>
-          <w:tblCellMar>
-            <w:top w:w="0" w:type="dxa"/>
-            <w:bottom w:w="0" w:type="dxa"/>
-          </w:tblCellMar>
-        </w:tblPrEx>
         <w:trPr>
           <w:cantSplit/>
         </w:trPr>
@@ -1419,12 +1347,6 @@
         </w:tc>
       </w:tr>
       <w:tr>
-        <w:tblPrEx>
-          <w:tblCellMar>
-            <w:top w:w="0" w:type="dxa"/>
-            <w:bottom w:w="0" w:type="dxa"/>
-          </w:tblCellMar>
-        </w:tblPrEx>
         <w:trPr>
           <w:cantSplit/>
         </w:trPr>
@@ -1624,12 +1546,6 @@
         <w:gridCol w:w="5938"/>
       </w:tblGrid>
       <w:tr>
-        <w:tblPrEx>
-          <w:tblCellMar>
-            <w:top w:w="0" w:type="dxa"/>
-            <w:bottom w:w="0" w:type="dxa"/>
-          </w:tblCellMar>
-        </w:tblPrEx>
         <w:trPr>
           <w:cantSplit/>
           <w:tblHeader/>
@@ -1733,12 +1649,6 @@
         </w:tc>
       </w:tr>
       <w:tr>
-        <w:tblPrEx>
-          <w:tblCellMar>
-            <w:top w:w="0" w:type="dxa"/>
-            <w:bottom w:w="0" w:type="dxa"/>
-          </w:tblCellMar>
-        </w:tblPrEx>
         <w:trPr>
           <w:cantSplit/>
         </w:trPr>
@@ -1827,12 +1737,6 @@
         </w:tc>
       </w:tr>
       <w:tr>
-        <w:tblPrEx>
-          <w:tblCellMar>
-            <w:top w:w="0" w:type="dxa"/>
-            <w:bottom w:w="0" w:type="dxa"/>
-          </w:tblCellMar>
-        </w:tblPrEx>
         <w:trPr>
           <w:cantSplit/>
         </w:trPr>
@@ -1913,12 +1817,6 @@
         </w:tc>
       </w:tr>
       <w:tr>
-        <w:tblPrEx>
-          <w:tblCellMar>
-            <w:top w:w="0" w:type="dxa"/>
-            <w:bottom w:w="0" w:type="dxa"/>
-          </w:tblCellMar>
-        </w:tblPrEx>
         <w:trPr>
           <w:cantSplit/>
         </w:trPr>
@@ -2039,12 +1937,6 @@
         <w:gridCol w:w="2438"/>
       </w:tblGrid>
       <w:tr>
-        <w:tblPrEx>
-          <w:tblCellMar>
-            <w:top w:w="0" w:type="dxa"/>
-            <w:bottom w:w="0" w:type="dxa"/>
-          </w:tblCellMar>
-        </w:tblPrEx>
         <w:trPr>
           <w:cantSplit/>
           <w:tblHeader/>
@@ -2147,12 +2039,6 @@
         </w:tc>
       </w:tr>
       <w:tr>
-        <w:tblPrEx>
-          <w:tblCellMar>
-            <w:top w:w="0" w:type="dxa"/>
-            <w:bottom w:w="0" w:type="dxa"/>
-          </w:tblCellMar>
-        </w:tblPrEx>
         <w:trPr>
           <w:cantSplit/>
         </w:trPr>
@@ -2267,12 +2153,6 @@
         </w:tc>
       </w:tr>
       <w:tr>
-        <w:tblPrEx>
-          <w:tblCellMar>
-            <w:top w:w="0" w:type="dxa"/>
-            <w:bottom w:w="0" w:type="dxa"/>
-          </w:tblCellMar>
-        </w:tblPrEx>
         <w:trPr>
           <w:cantSplit/>
         </w:trPr>
@@ -2384,12 +2264,6 @@
         </w:tc>
       </w:tr>
       <w:tr>
-        <w:tblPrEx>
-          <w:tblCellMar>
-            <w:top w:w="0" w:type="dxa"/>
-            <w:bottom w:w="0" w:type="dxa"/>
-          </w:tblCellMar>
-        </w:tblPrEx>
         <w:trPr>
           <w:cantSplit/>
         </w:trPr>
@@ -2504,12 +2378,6 @@
         </w:tc>
       </w:tr>
       <w:tr>
-        <w:tblPrEx>
-          <w:tblCellMar>
-            <w:top w:w="0" w:type="dxa"/>
-            <w:bottom w:w="0" w:type="dxa"/>
-          </w:tblCellMar>
-        </w:tblPrEx>
         <w:trPr>
           <w:cantSplit/>
         </w:trPr>
@@ -3015,12 +2883,6 @@
         <w:gridCol w:w="4300"/>
       </w:tblGrid>
       <w:tr>
-        <w:tblPrEx>
-          <w:tblCellMar>
-            <w:top w:w="0" w:type="dxa"/>
-            <w:bottom w:w="0" w:type="dxa"/>
-          </w:tblCellMar>
-        </w:tblPrEx>
         <w:trPr>
           <w:cantSplit/>
           <w:tblHeader/>
@@ -3155,12 +3017,6 @@
         </w:tc>
       </w:tr>
       <w:tr>
-        <w:tblPrEx>
-          <w:tblCellMar>
-            <w:top w:w="0" w:type="dxa"/>
-            <w:bottom w:w="0" w:type="dxa"/>
-          </w:tblCellMar>
-        </w:tblPrEx>
         <w:trPr>
           <w:cantSplit/>
         </w:trPr>
@@ -3266,12 +3122,6 @@
         </w:tc>
       </w:tr>
       <w:tr>
-        <w:tblPrEx>
-          <w:tblCellMar>
-            <w:top w:w="0" w:type="dxa"/>
-            <w:bottom w:w="0" w:type="dxa"/>
-          </w:tblCellMar>
-        </w:tblPrEx>
         <w:trPr>
           <w:cantSplit/>
         </w:trPr>
@@ -3401,12 +3251,6 @@
         </w:tc>
       </w:tr>
       <w:tr>
-        <w:tblPrEx>
-          <w:tblCellMar>
-            <w:top w:w="0" w:type="dxa"/>
-            <w:bottom w:w="0" w:type="dxa"/>
-          </w:tblCellMar>
-        </w:tblPrEx>
         <w:trPr>
           <w:cantSplit/>
         </w:trPr>
@@ -3512,12 +3356,6 @@
         </w:tc>
       </w:tr>
       <w:tr>
-        <w:tblPrEx>
-          <w:tblCellMar>
-            <w:top w:w="0" w:type="dxa"/>
-            <w:bottom w:w="0" w:type="dxa"/>
-          </w:tblCellMar>
-        </w:tblPrEx>
         <w:trPr>
           <w:cantSplit/>
         </w:trPr>
@@ -3631,12 +3469,6 @@
         </w:tc>
       </w:tr>
       <w:tr>
-        <w:tblPrEx>
-          <w:tblCellMar>
-            <w:top w:w="0" w:type="dxa"/>
-            <w:bottom w:w="0" w:type="dxa"/>
-          </w:tblCellMar>
-        </w:tblPrEx>
         <w:trPr>
           <w:cantSplit/>
         </w:trPr>
@@ -3661,7 +3493,10 @@
               <w:spacing w:after="40"/>
             </w:pPr>
             <w:r>
-              <w:t>P05</w:t>
+              <w:t>P0</w:t>
+            </w:r>
+            <w:r>
+              <w:t>5</w:t>
             </w:r>
           </w:p>
         </w:tc>
@@ -3686,7 +3521,7 @@
               <w:spacing w:after="40"/>
             </w:pPr>
             <w:r>
-              <w:t>Colunas repetidas em Estoque</w:t>
+              <w:t>Valores calculados guardados sem proteção</w:t>
             </w:r>
           </w:p>
         </w:tc>
@@ -3710,8 +3545,21 @@
             <w:pPr>
               <w:spacing w:after="40"/>
             </w:pPr>
-            <w:r>
-              <w:t>categoria e subcategoria repetem Produtos nas 125 linhas.</w:t>
+            <w:proofErr w:type="spellStart"/>
+            <w:r>
+              <w:t>valor_total</w:t>
+            </w:r>
+            <w:proofErr w:type="spellEnd"/>
+            <w:r>
+              <w:t xml:space="preserve"> e </w:t>
+            </w:r>
+            <w:proofErr w:type="spellStart"/>
+            <w:r>
+              <w:t>lucro_estimado</w:t>
+            </w:r>
+            <w:proofErr w:type="spellEnd"/>
+            <w:r>
+              <w:t xml:space="preserve"> são sempre derivados dos outros campos (5.999 de 5.999 conferem).</w:t>
             </w:r>
           </w:p>
         </w:tc>
@@ -3736,18 +3584,12 @@
               <w:spacing w:after="40"/>
             </w:pPr>
             <w:r>
-              <w:t>Mesma contradição possível, agora entre abas.</w:t>
+              <w:t>Se alguém digitar um valor, nada avisa que está errado.</w:t>
             </w:r>
           </w:p>
         </w:tc>
       </w:tr>
       <w:tr>
-        <w:tblPrEx>
-          <w:tblCellMar>
-            <w:top w:w="0" w:type="dxa"/>
-            <w:bottom w:w="0" w:type="dxa"/>
-          </w:tblCellMar>
-        </w:tblPrEx>
         <w:trPr>
           <w:cantSplit/>
         </w:trPr>
@@ -3772,7 +3614,10 @@
               <w:spacing w:after="40"/>
             </w:pPr>
             <w:r>
-              <w:t>P06</w:t>
+              <w:t>P0</w:t>
+            </w:r>
+            <w:r>
+              <w:t>6</w:t>
             </w:r>
           </w:p>
         </w:tc>
@@ -3797,7 +3642,7 @@
               <w:spacing w:after="40"/>
             </w:pPr>
             <w:r>
-              <w:t>Estado depende da cidade</w:t>
+              <w:t>Sem histórico de preço e de custo</w:t>
             </w:r>
           </w:p>
         </w:tc>
@@ -3822,7 +3667,7 @@
               <w:spacing w:after="40"/>
             </w:pPr>
             <w:r>
-              <w:t>15 cidades e 7 estados escritos por extenso 799 vezes em Clientes e 5.999 vezes em Vendas. Nenhuma cidade tem mais de um estado.</w:t>
+              <w:t>O preço da venda é igual ao do cadastro em 100% das linhas. O dicionário chama o preço de médio. O lucro usa o custo atual do produto.</w:t>
             </w:r>
           </w:p>
         </w:tc>
@@ -3847,26 +3692,12 @@
               <w:spacing w:after="40"/>
             </w:pPr>
             <w:r>
-              <w:t xml:space="preserve">Erro de digitação cria cidades diferentes (ex.: </w:t>
-            </w:r>
-            <w:proofErr w:type="spellStart"/>
-            <w:r>
-              <w:t>Niteroi</w:t>
-            </w:r>
-            <w:proofErr w:type="spellEnd"/>
-            <w:r>
-              <w:t>). Difícil agrupar.</w:t>
+              <w:t>Mudar o preço ou o custo altera o passado. O lucro antigo deixa de ser confiável.</w:t>
             </w:r>
           </w:p>
         </w:tc>
       </w:tr>
       <w:tr>
-        <w:tblPrEx>
-          <w:tblCellMar>
-            <w:top w:w="0" w:type="dxa"/>
-            <w:bottom w:w="0" w:type="dxa"/>
-          </w:tblCellMar>
-        </w:tblPrEx>
         <w:trPr>
           <w:cantSplit/>
         </w:trPr>
@@ -3891,7 +3722,11 @@
               <w:spacing w:after="40"/>
             </w:pPr>
             <w:r>
-              <w:t>P07</w:t>
+              <w:lastRenderedPageBreak/>
+              <w:t>P0</w:t>
+            </w:r>
+            <w:r>
+              <w:t>7</w:t>
             </w:r>
           </w:p>
         </w:tc>
@@ -3916,7 +3751,7 @@
               <w:spacing w:after="40"/>
             </w:pPr>
             <w:r>
-              <w:t>Valores calculados guardados sem proteção</w:t>
+              <w:t>Status pobre e ambíguo</w:t>
             </w:r>
           </w:p>
         </w:tc>
@@ -3940,21 +3775,8 @@
             <w:pPr>
               <w:spacing w:after="40"/>
             </w:pPr>
-            <w:proofErr w:type="spellStart"/>
-            <w:r>
-              <w:t>valor_total</w:t>
-            </w:r>
-            <w:proofErr w:type="spellEnd"/>
-            <w:r>
-              <w:t xml:space="preserve"> e </w:t>
-            </w:r>
-            <w:proofErr w:type="spellStart"/>
-            <w:r>
-              <w:t>lucro_estimado</w:t>
-            </w:r>
-            <w:proofErr w:type="spellEnd"/>
-            <w:r>
-              <w:t xml:space="preserve"> são sempre derivados dos outros campos (5.999 de 5.999 conferem).</w:t>
+            <w:r>
+              <w:t>Só 4 valores finais. Não há etapas de andamento (pago, enviado). Concluído e Entregue se confundem. Troca é um evento, e não uma situação. Não há regra de transição.</w:t>
             </w:r>
           </w:p>
         </w:tc>
@@ -3979,18 +3801,12 @@
               <w:spacing w:after="40"/>
             </w:pPr>
             <w:r>
-              <w:t>Se alguém digitar um valor, nada avisa que está errado.</w:t>
+              <w:t>Dá para ir de qualquer status para qualquer outro.</w:t>
             </w:r>
           </w:p>
         </w:tc>
       </w:tr>
       <w:tr>
-        <w:tblPrEx>
-          <w:tblCellMar>
-            <w:top w:w="0" w:type="dxa"/>
-            <w:bottom w:w="0" w:type="dxa"/>
-          </w:tblCellMar>
-        </w:tblPrEx>
         <w:trPr>
           <w:cantSplit/>
         </w:trPr>
@@ -4015,8 +3831,10 @@
               <w:spacing w:after="40"/>
             </w:pPr>
             <w:r>
-              <w:lastRenderedPageBreak/>
-              <w:t>P08</w:t>
+              <w:t>P</w:t>
+            </w:r>
+            <w:r>
+              <w:t>08</w:t>
             </w:r>
           </w:p>
         </w:tc>
@@ -4041,7 +3859,7 @@
               <w:spacing w:after="40"/>
             </w:pPr>
             <w:r>
-              <w:t>Sem histórico de preço e de custo</w:t>
+              <w:t>Cancelados somados na receita</w:t>
             </w:r>
           </w:p>
         </w:tc>
@@ -4066,7 +3884,7 @@
               <w:spacing w:after="40"/>
             </w:pPr>
             <w:r>
-              <w:t>O preço da venda é igual ao do cadastro em 100% das linhas. O dicionário chama o preço de médio. O lucro usa o custo atual do produto.</w:t>
+              <w:t>324 pedidos cancelados somam R$ 257.048,16 (5,3% de R$ 4.852.558,18) e R$ 126.190,39 de lucro estimado.</w:t>
             </w:r>
           </w:p>
         </w:tc>
@@ -4091,18 +3909,12 @@
               <w:spacing w:after="40"/>
             </w:pPr>
             <w:r>
-              <w:t>Mudar o preço ou o custo altera o passado. O lucro antigo deixa de ser confiável.</w:t>
+              <w:t>Relatórios que somam tudo mostram receita e lucro inflados.</w:t>
             </w:r>
           </w:p>
         </w:tc>
       </w:tr>
       <w:tr>
-        <w:tblPrEx>
-          <w:tblCellMar>
-            <w:top w:w="0" w:type="dxa"/>
-            <w:bottom w:w="0" w:type="dxa"/>
-          </w:tblCellMar>
-        </w:tblPrEx>
         <w:trPr>
           <w:cantSplit/>
         </w:trPr>
@@ -4127,7 +3939,10 @@
               <w:spacing w:after="40"/>
             </w:pPr>
             <w:r>
-              <w:t>P09</w:t>
+              <w:t>P</w:t>
+            </w:r>
+            <w:r>
+              <w:t>09</w:t>
             </w:r>
           </w:p>
         </w:tc>
@@ -4152,7 +3967,7 @@
               <w:spacing w:after="40"/>
             </w:pPr>
             <w:r>
-              <w:t>Status pobre e ambíguo</w:t>
+              <w:t>Estoque sem movimentação</w:t>
             </w:r>
           </w:p>
         </w:tc>
@@ -4176,8 +3991,13 @@
             <w:pPr>
               <w:spacing w:after="40"/>
             </w:pPr>
-            <w:r>
-              <w:t>Só 4 valores finais. Não há etapas de andamento (pago, enviado). Concluído e Entregue se confundem. Troca é um evento, e não uma situação. Não há regra de transição.</w:t>
+            <w:proofErr w:type="spellStart"/>
+            <w:r>
+              <w:t>estoque_atual</w:t>
+            </w:r>
+            <w:proofErr w:type="spellEnd"/>
+            <w:r>
+              <w:t xml:space="preserve"> é um número solto. Nada mostra se as vendas baixam o estoque. 8 produtos estão abaixo do mínimo sem alerta.</w:t>
             </w:r>
           </w:p>
         </w:tc>
@@ -4202,18 +4022,12 @@
               <w:spacing w:after="40"/>
             </w:pPr>
             <w:r>
-              <w:t>Dá para ir de qualquer status para qualquer outro.</w:t>
+              <w:t>Risco de vender sem ter o produto e de a reposição atrasar.</w:t>
             </w:r>
           </w:p>
         </w:tc>
       </w:tr>
       <w:tr>
-        <w:tblPrEx>
-          <w:tblCellMar>
-            <w:top w:w="0" w:type="dxa"/>
-            <w:bottom w:w="0" w:type="dxa"/>
-          </w:tblCellMar>
-        </w:tblPrEx>
         <w:trPr>
           <w:cantSplit/>
         </w:trPr>
@@ -4238,7 +4052,10 @@
               <w:spacing w:after="40"/>
             </w:pPr>
             <w:r>
-              <w:t>P10</w:t>
+              <w:t>P1</w:t>
+            </w:r>
+            <w:r>
+              <w:t>0</w:t>
             </w:r>
           </w:p>
         </w:tc>
@@ -4263,7 +4080,7 @@
               <w:spacing w:after="40"/>
             </w:pPr>
             <w:r>
-              <w:t>Cancelados somados na receita</w:t>
+              <w:t>Tamanho de letra para calçado</w:t>
             </w:r>
           </w:p>
         </w:tc>
@@ -4288,7 +4105,7 @@
               <w:spacing w:after="40"/>
             </w:pPr>
             <w:r>
-              <w:t>324 pedidos cancelados somam R$ 257.048,16 (5,3% de R$ 4.852.558,18) e R$ 126.190,39 de lucro estimado.</w:t>
+              <w:t>Os 5 tamanhos de letra (PP a GG) são usados nas 1.019 vendas de tênis.</w:t>
             </w:r>
           </w:p>
         </w:tc>
@@ -4313,18 +4130,12 @@
               <w:spacing w:after="40"/>
             </w:pPr>
             <w:r>
-              <w:t>Relatórios que somam tudo mostram receita e lucro inflados.</w:t>
+              <w:t>Calçado usa numeração. O dado não representa o que foi vendido.</w:t>
             </w:r>
           </w:p>
         </w:tc>
       </w:tr>
       <w:tr>
-        <w:tblPrEx>
-          <w:tblCellMar>
-            <w:top w:w="0" w:type="dxa"/>
-            <w:bottom w:w="0" w:type="dxa"/>
-          </w:tblCellMar>
-        </w:tblPrEx>
         <w:trPr>
           <w:cantSplit/>
         </w:trPr>
@@ -4349,7 +4160,10 @@
               <w:spacing w:after="40"/>
             </w:pPr>
             <w:r>
-              <w:t>P11</w:t>
+              <w:t>P1</w:t>
+            </w:r>
+            <w:r>
+              <w:t>1</w:t>
             </w:r>
           </w:p>
         </w:tc>
@@ -4374,7 +4188,7 @@
               <w:spacing w:after="40"/>
             </w:pPr>
             <w:r>
-              <w:t>Estoque sem movimentação</w:t>
+              <w:t>Estoque por produto, venda por tamanho</w:t>
             </w:r>
           </w:p>
         </w:tc>
@@ -4398,13 +4212,8 @@
             <w:pPr>
               <w:spacing w:after="40"/>
             </w:pPr>
-            <w:proofErr w:type="spellStart"/>
-            <w:r>
-              <w:t>estoque_atual</w:t>
-            </w:r>
-            <w:proofErr w:type="spellEnd"/>
-            <w:r>
-              <w:t xml:space="preserve"> é um número solto. Nada mostra se as vendas baixam o estoque. 8 produtos estão abaixo do mínimo sem alerta.</w:t>
+            <w:r>
+              <w:t>O estoque não separa tamanhos, mas a venda registra o tamanho.</w:t>
             </w:r>
           </w:p>
         </w:tc>
@@ -4429,18 +4238,12 @@
               <w:spacing w:after="40"/>
             </w:pPr>
             <w:r>
-              <w:t>Risco de vender sem ter o produto e de a reposição atrasar.</w:t>
+              <w:t>Não dá para saber se existe o tamanho pedido. Limite conhecido desta versão.</w:t>
             </w:r>
           </w:p>
         </w:tc>
       </w:tr>
       <w:tr>
-        <w:tblPrEx>
-          <w:tblCellMar>
-            <w:top w:w="0" w:type="dxa"/>
-            <w:bottom w:w="0" w:type="dxa"/>
-          </w:tblCellMar>
-        </w:tblPrEx>
         <w:trPr>
           <w:cantSplit/>
         </w:trPr>
@@ -4465,7 +4268,10 @@
               <w:spacing w:after="40"/>
             </w:pPr>
             <w:r>
-              <w:t>P12</w:t>
+              <w:t>P1</w:t>
+            </w:r>
+            <w:r>
+              <w:t>2</w:t>
             </w:r>
           </w:p>
         </w:tc>
@@ -4490,7 +4296,7 @@
               <w:spacing w:after="40"/>
             </w:pPr>
             <w:r>
-              <w:t>Tamanho de letra para calçado</w:t>
+              <w:t>Regra de desconto não documentada</w:t>
             </w:r>
           </w:p>
         </w:tc>
@@ -4515,7 +4321,7 @@
               <w:spacing w:after="40"/>
             </w:pPr>
             <w:r>
-              <w:t>Os 5 tamanhos de letra (PP a GG) são usados nas 1.019 vendas de tênis.</w:t>
+              <w:t>Só 0%, 5%, 10% e 15%. A distribuição é igual para quem tem e quem não tem fidelidade.</w:t>
             </w:r>
           </w:p>
         </w:tc>
@@ -4540,451 +4346,7 @@
               <w:spacing w:after="40"/>
             </w:pPr>
             <w:r>
-              <w:t>Calçado usa numeração. O dado não representa o que foi vendido.</w:t>
-            </w:r>
-          </w:p>
-        </w:tc>
-      </w:tr>
-      <w:tr>
-        <w:tblPrEx>
-          <w:tblCellMar>
-            <w:top w:w="0" w:type="dxa"/>
-            <w:bottom w:w="0" w:type="dxa"/>
-          </w:tblCellMar>
-        </w:tblPrEx>
-        <w:trPr>
-          <w:cantSplit/>
-        </w:trPr>
-        <w:tc>
-          <w:tcPr>
-            <w:tcW w:w="1150" w:type="dxa"/>
-            <w:tcBorders>
-              <w:top w:val="single" w:sz="4" w:space="0" w:color="000000"/>
-              <w:left w:val="single" w:sz="4" w:space="0" w:color="000000"/>
-              <w:bottom w:val="single" w:sz="4" w:space="0" w:color="000000"/>
-              <w:right w:val="single" w:sz="4" w:space="0" w:color="000000"/>
-            </w:tcBorders>
-            <w:tcMar>
-              <w:top w:w="60" w:type="dxa"/>
-              <w:left w:w="100" w:type="dxa"/>
-              <w:bottom w:w="60" w:type="dxa"/>
-              <w:right w:w="100" w:type="dxa"/>
-            </w:tcMar>
-          </w:tcPr>
-          <w:p>
-            <w:pPr>
-              <w:spacing w:after="40"/>
-            </w:pPr>
-            <w:r>
-              <w:t>P13</w:t>
-            </w:r>
-          </w:p>
-        </w:tc>
-        <w:tc>
-          <w:tcPr>
-            <w:tcW w:w="2700" w:type="dxa"/>
-            <w:tcBorders>
-              <w:top w:val="single" w:sz="4" w:space="0" w:color="000000"/>
-              <w:left w:val="single" w:sz="4" w:space="0" w:color="000000"/>
-              <w:bottom w:val="single" w:sz="4" w:space="0" w:color="000000"/>
-              <w:right w:val="single" w:sz="4" w:space="0" w:color="000000"/>
-            </w:tcBorders>
-            <w:tcMar>
-              <w:top w:w="60" w:type="dxa"/>
-              <w:left w:w="100" w:type="dxa"/>
-              <w:bottom w:w="60" w:type="dxa"/>
-              <w:right w:w="100" w:type="dxa"/>
-            </w:tcMar>
-          </w:tcPr>
-          <w:p>
-            <w:pPr>
-              <w:spacing w:after="40"/>
-            </w:pPr>
-            <w:r>
-              <w:t>Estoque por produto, venda por tamanho</w:t>
-            </w:r>
-          </w:p>
-        </w:tc>
-        <w:tc>
-          <w:tcPr>
-            <w:tcW w:w="6420" w:type="dxa"/>
-            <w:tcBorders>
-              <w:top w:val="single" w:sz="4" w:space="0" w:color="000000"/>
-              <w:left w:val="single" w:sz="4" w:space="0" w:color="000000"/>
-              <w:bottom w:val="single" w:sz="4" w:space="0" w:color="000000"/>
-              <w:right w:val="single" w:sz="4" w:space="0" w:color="000000"/>
-            </w:tcBorders>
-            <w:tcMar>
-              <w:top w:w="60" w:type="dxa"/>
-              <w:left w:w="100" w:type="dxa"/>
-              <w:bottom w:w="60" w:type="dxa"/>
-              <w:right w:w="100" w:type="dxa"/>
-            </w:tcMar>
-          </w:tcPr>
-          <w:p>
-            <w:pPr>
-              <w:spacing w:after="40"/>
-            </w:pPr>
-            <w:r>
-              <w:t>O estoque não separa tamanhos, mas a venda registra o tamanho.</w:t>
-            </w:r>
-          </w:p>
-        </w:tc>
-        <w:tc>
-          <w:tcPr>
-            <w:tcW w:w="4300" w:type="dxa"/>
-            <w:tcBorders>
-              <w:top w:val="single" w:sz="4" w:space="0" w:color="000000"/>
-              <w:left w:val="single" w:sz="4" w:space="0" w:color="000000"/>
-              <w:bottom w:val="single" w:sz="4" w:space="0" w:color="000000"/>
-              <w:right w:val="single" w:sz="4" w:space="0" w:color="000000"/>
-            </w:tcBorders>
-            <w:tcMar>
-              <w:top w:w="60" w:type="dxa"/>
-              <w:left w:w="100" w:type="dxa"/>
-              <w:bottom w:w="60" w:type="dxa"/>
-              <w:right w:w="100" w:type="dxa"/>
-            </w:tcMar>
-          </w:tcPr>
-          <w:p>
-            <w:pPr>
-              <w:spacing w:after="40"/>
-            </w:pPr>
-            <w:r>
-              <w:t>Não dá para saber se existe o tamanho pedido. Limite conhecido desta versão.</w:t>
-            </w:r>
-          </w:p>
-        </w:tc>
-      </w:tr>
-      <w:tr>
-        <w:tblPrEx>
-          <w:tblCellMar>
-            <w:top w:w="0" w:type="dxa"/>
-            <w:bottom w:w="0" w:type="dxa"/>
-          </w:tblCellMar>
-        </w:tblPrEx>
-        <w:trPr>
-          <w:cantSplit/>
-        </w:trPr>
-        <w:tc>
-          <w:tcPr>
-            <w:tcW w:w="1150" w:type="dxa"/>
-            <w:tcBorders>
-              <w:top w:val="single" w:sz="4" w:space="0" w:color="000000"/>
-              <w:left w:val="single" w:sz="4" w:space="0" w:color="000000"/>
-              <w:bottom w:val="single" w:sz="4" w:space="0" w:color="000000"/>
-              <w:right w:val="single" w:sz="4" w:space="0" w:color="000000"/>
-            </w:tcBorders>
-            <w:tcMar>
-              <w:top w:w="60" w:type="dxa"/>
-              <w:left w:w="100" w:type="dxa"/>
-              <w:bottom w:w="60" w:type="dxa"/>
-              <w:right w:w="100" w:type="dxa"/>
-            </w:tcMar>
-          </w:tcPr>
-          <w:p>
-            <w:pPr>
-              <w:spacing w:after="40"/>
-            </w:pPr>
-            <w:r>
-              <w:t>P14</w:t>
-            </w:r>
-          </w:p>
-        </w:tc>
-        <w:tc>
-          <w:tcPr>
-            <w:tcW w:w="2700" w:type="dxa"/>
-            <w:tcBorders>
-              <w:top w:val="single" w:sz="4" w:space="0" w:color="000000"/>
-              <w:left w:val="single" w:sz="4" w:space="0" w:color="000000"/>
-              <w:bottom w:val="single" w:sz="4" w:space="0" w:color="000000"/>
-              <w:right w:val="single" w:sz="4" w:space="0" w:color="000000"/>
-            </w:tcBorders>
-            <w:tcMar>
-              <w:top w:w="60" w:type="dxa"/>
-              <w:left w:w="100" w:type="dxa"/>
-              <w:bottom w:w="60" w:type="dxa"/>
-              <w:right w:w="100" w:type="dxa"/>
-            </w:tcMar>
-          </w:tcPr>
-          <w:p>
-            <w:pPr>
-              <w:spacing w:after="40"/>
-            </w:pPr>
-            <w:r>
-              <w:t>Regra de desconto não documentada</w:t>
-            </w:r>
-          </w:p>
-        </w:tc>
-        <w:tc>
-          <w:tcPr>
-            <w:tcW w:w="6420" w:type="dxa"/>
-            <w:tcBorders>
-              <w:top w:val="single" w:sz="4" w:space="0" w:color="000000"/>
-              <w:left w:val="single" w:sz="4" w:space="0" w:color="000000"/>
-              <w:bottom w:val="single" w:sz="4" w:space="0" w:color="000000"/>
-              <w:right w:val="single" w:sz="4" w:space="0" w:color="000000"/>
-            </w:tcBorders>
-            <w:tcMar>
-              <w:top w:w="60" w:type="dxa"/>
-              <w:left w:w="100" w:type="dxa"/>
-              <w:bottom w:w="60" w:type="dxa"/>
-              <w:right w:w="100" w:type="dxa"/>
-            </w:tcMar>
-          </w:tcPr>
-          <w:p>
-            <w:pPr>
-              <w:spacing w:after="40"/>
-            </w:pPr>
-            <w:r>
-              <w:t>Só 0%, 5%, 10% e 15%. A distribuição é igual para quem tem e quem não tem fidelidade.</w:t>
-            </w:r>
-          </w:p>
-        </w:tc>
-        <w:tc>
-          <w:tcPr>
-            <w:tcW w:w="4300" w:type="dxa"/>
-            <w:tcBorders>
-              <w:top w:val="single" w:sz="4" w:space="0" w:color="000000"/>
-              <w:left w:val="single" w:sz="4" w:space="0" w:color="000000"/>
-              <w:bottom w:val="single" w:sz="4" w:space="0" w:color="000000"/>
-              <w:right w:val="single" w:sz="4" w:space="0" w:color="000000"/>
-            </w:tcBorders>
-            <w:tcMar>
-              <w:top w:w="60" w:type="dxa"/>
-              <w:left w:w="100" w:type="dxa"/>
-              <w:bottom w:w="60" w:type="dxa"/>
-              <w:right w:w="100" w:type="dxa"/>
-            </w:tcMar>
-          </w:tcPr>
-          <w:p>
-            <w:pPr>
-              <w:spacing w:after="40"/>
-            </w:pPr>
-            <w:r>
               <w:t>Não dá para validar nem explicar um desconto.</w:t>
-            </w:r>
-          </w:p>
-        </w:tc>
-      </w:tr>
-      <w:tr>
-        <w:tblPrEx>
-          <w:tblCellMar>
-            <w:top w:w="0" w:type="dxa"/>
-            <w:bottom w:w="0" w:type="dxa"/>
-          </w:tblCellMar>
-        </w:tblPrEx>
-        <w:trPr>
-          <w:cantSplit/>
-        </w:trPr>
-        <w:tc>
-          <w:tcPr>
-            <w:tcW w:w="1150" w:type="dxa"/>
-            <w:tcBorders>
-              <w:top w:val="single" w:sz="4" w:space="0" w:color="000000"/>
-              <w:left w:val="single" w:sz="4" w:space="0" w:color="000000"/>
-              <w:bottom w:val="single" w:sz="4" w:space="0" w:color="000000"/>
-              <w:right w:val="single" w:sz="4" w:space="0" w:color="000000"/>
-            </w:tcBorders>
-            <w:tcMar>
-              <w:top w:w="60" w:type="dxa"/>
-              <w:left w:w="100" w:type="dxa"/>
-              <w:bottom w:w="60" w:type="dxa"/>
-              <w:right w:w="100" w:type="dxa"/>
-            </w:tcMar>
-          </w:tcPr>
-          <w:p>
-            <w:pPr>
-              <w:spacing w:after="40"/>
-            </w:pPr>
-            <w:r>
-              <w:t>P15</w:t>
-            </w:r>
-          </w:p>
-        </w:tc>
-        <w:tc>
-          <w:tcPr>
-            <w:tcW w:w="2700" w:type="dxa"/>
-            <w:tcBorders>
-              <w:top w:val="single" w:sz="4" w:space="0" w:color="000000"/>
-              <w:left w:val="single" w:sz="4" w:space="0" w:color="000000"/>
-              <w:bottom w:val="single" w:sz="4" w:space="0" w:color="000000"/>
-              <w:right w:val="single" w:sz="4" w:space="0" w:color="000000"/>
-            </w:tcBorders>
-            <w:tcMar>
-              <w:top w:w="60" w:type="dxa"/>
-              <w:left w:w="100" w:type="dxa"/>
-              <w:bottom w:w="60" w:type="dxa"/>
-              <w:right w:w="100" w:type="dxa"/>
-            </w:tcMar>
-          </w:tcPr>
-          <w:p>
-            <w:pPr>
-              <w:spacing w:after="40"/>
-            </w:pPr>
-            <w:r>
-              <w:t>Dicionário de dados incompleto</w:t>
-            </w:r>
-          </w:p>
-        </w:tc>
-        <w:tc>
-          <w:tcPr>
-            <w:tcW w:w="6420" w:type="dxa"/>
-            <w:tcBorders>
-              <w:top w:val="single" w:sz="4" w:space="0" w:color="000000"/>
-              <w:left w:val="single" w:sz="4" w:space="0" w:color="000000"/>
-              <w:bottom w:val="single" w:sz="4" w:space="0" w:color="000000"/>
-              <w:right w:val="single" w:sz="4" w:space="0" w:color="000000"/>
-            </w:tcBorders>
-            <w:tcMar>
-              <w:top w:w="60" w:type="dxa"/>
-              <w:left w:w="100" w:type="dxa"/>
-              <w:bottom w:w="60" w:type="dxa"/>
-              <w:right w:w="100" w:type="dxa"/>
-            </w:tcMar>
-          </w:tcPr>
-          <w:p>
-            <w:pPr>
-              <w:spacing w:after="40"/>
-            </w:pPr>
-            <w:r>
-              <w:t>Descreve 9 dos 44 campos (cerca de 20%). Subcategoria Casual existe em duas categorias (Tênis e Vestido).</w:t>
-            </w:r>
-          </w:p>
-        </w:tc>
-        <w:tc>
-          <w:tcPr>
-            <w:tcW w:w="4300" w:type="dxa"/>
-            <w:tcBorders>
-              <w:top w:val="single" w:sz="4" w:space="0" w:color="000000"/>
-              <w:left w:val="single" w:sz="4" w:space="0" w:color="000000"/>
-              <w:bottom w:val="single" w:sz="4" w:space="0" w:color="000000"/>
-              <w:right w:val="single" w:sz="4" w:space="0" w:color="000000"/>
-            </w:tcBorders>
-            <w:tcMar>
-              <w:top w:w="60" w:type="dxa"/>
-              <w:left w:w="100" w:type="dxa"/>
-              <w:bottom w:w="60" w:type="dxa"/>
-              <w:right w:w="100" w:type="dxa"/>
-            </w:tcMar>
-          </w:tcPr>
-          <w:p>
-            <w:pPr>
-              <w:spacing w:after="40"/>
-            </w:pPr>
-            <w:r>
-              <w:t>Quem usa os dados precisa adivinhar o significado.</w:t>
-            </w:r>
-          </w:p>
-        </w:tc>
-      </w:tr>
-      <w:tr>
-        <w:tblPrEx>
-          <w:tblCellMar>
-            <w:top w:w="0" w:type="dxa"/>
-            <w:bottom w:w="0" w:type="dxa"/>
-          </w:tblCellMar>
-        </w:tblPrEx>
-        <w:trPr>
-          <w:cantSplit/>
-        </w:trPr>
-        <w:tc>
-          <w:tcPr>
-            <w:tcW w:w="1150" w:type="dxa"/>
-            <w:tcBorders>
-              <w:top w:val="single" w:sz="4" w:space="0" w:color="000000"/>
-              <w:left w:val="single" w:sz="4" w:space="0" w:color="000000"/>
-              <w:bottom w:val="single" w:sz="4" w:space="0" w:color="000000"/>
-              <w:right w:val="single" w:sz="4" w:space="0" w:color="000000"/>
-            </w:tcBorders>
-            <w:tcMar>
-              <w:top w:w="60" w:type="dxa"/>
-              <w:left w:w="100" w:type="dxa"/>
-              <w:bottom w:w="60" w:type="dxa"/>
-              <w:right w:w="100" w:type="dxa"/>
-            </w:tcMar>
-          </w:tcPr>
-          <w:p>
-            <w:pPr>
-              <w:spacing w:after="40"/>
-            </w:pPr>
-            <w:r>
-              <w:t>P16</w:t>
-            </w:r>
-          </w:p>
-        </w:tc>
-        <w:tc>
-          <w:tcPr>
-            <w:tcW w:w="2700" w:type="dxa"/>
-            <w:tcBorders>
-              <w:top w:val="single" w:sz="4" w:space="0" w:color="000000"/>
-              <w:left w:val="single" w:sz="4" w:space="0" w:color="000000"/>
-              <w:bottom w:val="single" w:sz="4" w:space="0" w:color="000000"/>
-              <w:right w:val="single" w:sz="4" w:space="0" w:color="000000"/>
-            </w:tcBorders>
-            <w:tcMar>
-              <w:top w:w="60" w:type="dxa"/>
-              <w:left w:w="100" w:type="dxa"/>
-              <w:bottom w:w="60" w:type="dxa"/>
-              <w:right w:w="100" w:type="dxa"/>
-            </w:tcMar>
-          </w:tcPr>
-          <w:p>
-            <w:pPr>
-              <w:spacing w:after="40"/>
-            </w:pPr>
-            <w:r>
-              <w:t>Fornecedor em texto repetido</w:t>
-            </w:r>
-          </w:p>
-        </w:tc>
-        <w:tc>
-          <w:tcPr>
-            <w:tcW w:w="6420" w:type="dxa"/>
-            <w:tcBorders>
-              <w:top w:val="single" w:sz="4" w:space="0" w:color="000000"/>
-              <w:left w:val="single" w:sz="4" w:space="0" w:color="000000"/>
-              <w:bottom w:val="single" w:sz="4" w:space="0" w:color="000000"/>
-              <w:right w:val="single" w:sz="4" w:space="0" w:color="000000"/>
-            </w:tcBorders>
-            <w:tcMar>
-              <w:top w:w="60" w:type="dxa"/>
-              <w:left w:w="100" w:type="dxa"/>
-              <w:bottom w:w="60" w:type="dxa"/>
-              <w:right w:w="100" w:type="dxa"/>
-            </w:tcMar>
-          </w:tcPr>
-          <w:p>
-            <w:pPr>
-              <w:spacing w:after="40"/>
-            </w:pPr>
-            <w:r>
-              <w:t>4 fornecedores escritos por extenso em 125 linhas. Cada fornecedor tem de 20 a 22 tempos de reposição diferentes.</w:t>
-            </w:r>
-          </w:p>
-        </w:tc>
-        <w:tc>
-          <w:tcPr>
-            <w:tcW w:w="4300" w:type="dxa"/>
-            <w:tcBorders>
-              <w:top w:val="single" w:sz="4" w:space="0" w:color="000000"/>
-              <w:left w:val="single" w:sz="4" w:space="0" w:color="000000"/>
-              <w:bottom w:val="single" w:sz="4" w:space="0" w:color="000000"/>
-              <w:right w:val="single" w:sz="4" w:space="0" w:color="000000"/>
-            </w:tcBorders>
-            <w:tcMar>
-              <w:top w:w="60" w:type="dxa"/>
-              <w:left w:w="100" w:type="dxa"/>
-              <w:bottom w:w="60" w:type="dxa"/>
-              <w:right w:w="100" w:type="dxa"/>
-            </w:tcMar>
-          </w:tcPr>
-          <w:p>
-            <w:pPr>
-              <w:spacing w:after="40"/>
-            </w:pPr>
-            <w:r>
-              <w:t>O tempo de reposição pertence ao produto, e não ao fornecedor. Isso deve ficar claro no modelo.</w:t>
             </w:r>
           </w:p>
         </w:tc>
@@ -4996,7 +4358,6 @@
         <w:keepNext/>
       </w:pPr>
       <w:r>
-        <w:lastRenderedPageBreak/>
         <w:t>3. Requisitos legados, revisados e novos (fase 1)</w:t>
       </w:r>
     </w:p>
@@ -5014,7 +4375,7 @@
         <w:spacing w:after="120"/>
       </w:pPr>
       <w:r>
-        <w:t>Não existe documento de requisitos do legado. Os requisitos abaixo foram deduzidos do que a planilha guarda e calcula. O código RL é usado na matriz.</w:t>
+        <w:t>Os requisitos abaixo foram deduzidos do que a planilha guarda e calcula. O código RL é usado na matriz.</w:t>
       </w:r>
     </w:p>
     <w:tbl>
@@ -5040,12 +4401,6 @@
         <w:gridCol w:w="4100"/>
       </w:tblGrid>
       <w:tr>
-        <w:tblPrEx>
-          <w:tblCellMar>
-            <w:top w:w="0" w:type="dxa"/>
-            <w:bottom w:w="0" w:type="dxa"/>
-          </w:tblCellMar>
-        </w:tblPrEx>
         <w:trPr>
           <w:cantSplit/>
           <w:tblHeader/>
@@ -5148,12 +4503,6 @@
         </w:tc>
       </w:tr>
       <w:tr>
-        <w:tblPrEx>
-          <w:tblCellMar>
-            <w:top w:w="0" w:type="dxa"/>
-            <w:bottom w:w="0" w:type="dxa"/>
-          </w:tblCellMar>
-        </w:tblPrEx>
         <w:trPr>
           <w:cantSplit/>
         </w:trPr>
@@ -5234,12 +4583,6 @@
         </w:tc>
       </w:tr>
       <w:tr>
-        <w:tblPrEx>
-          <w:tblCellMar>
-            <w:top w:w="0" w:type="dxa"/>
-            <w:bottom w:w="0" w:type="dxa"/>
-          </w:tblCellMar>
-        </w:tblPrEx>
         <w:trPr>
           <w:cantSplit/>
         </w:trPr>
@@ -5320,12 +4663,6 @@
         </w:tc>
       </w:tr>
       <w:tr>
-        <w:tblPrEx>
-          <w:tblCellMar>
-            <w:top w:w="0" w:type="dxa"/>
-            <w:bottom w:w="0" w:type="dxa"/>
-          </w:tblCellMar>
-        </w:tblPrEx>
         <w:trPr>
           <w:cantSplit/>
         </w:trPr>
@@ -5350,6 +4687,7 @@
               <w:spacing w:after="40"/>
             </w:pPr>
             <w:r>
+              <w:lastRenderedPageBreak/>
               <w:t>RL03</w:t>
             </w:r>
           </w:p>
@@ -5406,12 +4744,6 @@
         </w:tc>
       </w:tr>
       <w:tr>
-        <w:tblPrEx>
-          <w:tblCellMar>
-            <w:top w:w="0" w:type="dxa"/>
-            <w:bottom w:w="0" w:type="dxa"/>
-          </w:tblCellMar>
-        </w:tblPrEx>
         <w:trPr>
           <w:cantSplit/>
         </w:trPr>
@@ -5492,12 +4824,6 @@
         </w:tc>
       </w:tr>
       <w:tr>
-        <w:tblPrEx>
-          <w:tblCellMar>
-            <w:top w:w="0" w:type="dxa"/>
-            <w:bottom w:w="0" w:type="dxa"/>
-          </w:tblCellMar>
-        </w:tblPrEx>
         <w:trPr>
           <w:cantSplit/>
         </w:trPr>
@@ -5578,12 +4904,6 @@
         </w:tc>
       </w:tr>
       <w:tr>
-        <w:tblPrEx>
-          <w:tblCellMar>
-            <w:top w:w="0" w:type="dxa"/>
-            <w:bottom w:w="0" w:type="dxa"/>
-          </w:tblCellMar>
-        </w:tblPrEx>
         <w:trPr>
           <w:cantSplit/>
         </w:trPr>
@@ -5672,12 +4992,6 @@
         </w:tc>
       </w:tr>
       <w:tr>
-        <w:tblPrEx>
-          <w:tblCellMar>
-            <w:top w:w="0" w:type="dxa"/>
-            <w:bottom w:w="0" w:type="dxa"/>
-          </w:tblCellMar>
-        </w:tblPrEx>
         <w:trPr>
           <w:cantSplit/>
         </w:trPr>
@@ -5771,12 +5085,6 @@
         </w:tc>
       </w:tr>
       <w:tr>
-        <w:tblPrEx>
-          <w:tblCellMar>
-            <w:top w:w="0" w:type="dxa"/>
-            <w:bottom w:w="0" w:type="dxa"/>
-          </w:tblCellMar>
-        </w:tblPrEx>
         <w:trPr>
           <w:cantSplit/>
         </w:trPr>
@@ -5857,12 +5165,6 @@
         </w:tc>
       </w:tr>
       <w:tr>
-        <w:tblPrEx>
-          <w:tblCellMar>
-            <w:top w:w="0" w:type="dxa"/>
-            <w:bottom w:w="0" w:type="dxa"/>
-          </w:tblCellMar>
-        </w:tblPrEx>
         <w:trPr>
           <w:cantSplit/>
         </w:trPr>
@@ -5943,12 +5245,6 @@
         </w:tc>
       </w:tr>
       <w:tr>
-        <w:tblPrEx>
-          <w:tblCellMar>
-            <w:top w:w="0" w:type="dxa"/>
-            <w:bottom w:w="0" w:type="dxa"/>
-          </w:tblCellMar>
-        </w:tblPrEx>
         <w:trPr>
           <w:cantSplit/>
         </w:trPr>
@@ -6100,7 +5396,6 @@
         <w:keepNext/>
       </w:pPr>
       <w:r>
-        <w:lastRenderedPageBreak/>
         <w:t>Requisitos funcionais</w:t>
       </w:r>
     </w:p>
@@ -6128,12 +5423,6 @@
         <w:gridCol w:w="1700"/>
       </w:tblGrid>
       <w:tr>
-        <w:tblPrEx>
-          <w:tblCellMar>
-            <w:top w:w="0" w:type="dxa"/>
-            <w:bottom w:w="0" w:type="dxa"/>
-          </w:tblCellMar>
-        </w:tblPrEx>
         <w:trPr>
           <w:cantSplit/>
           <w:tblHeader/>
@@ -6268,12 +5557,6 @@
         </w:tc>
       </w:tr>
       <w:tr>
-        <w:tblPrEx>
-          <w:tblCellMar>
-            <w:top w:w="0" w:type="dxa"/>
-            <w:bottom w:w="0" w:type="dxa"/>
-          </w:tblCellMar>
-        </w:tblPrEx>
         <w:trPr>
           <w:cantSplit/>
         </w:trPr>
@@ -6379,12 +5662,6 @@
         </w:tc>
       </w:tr>
       <w:tr>
-        <w:tblPrEx>
-          <w:tblCellMar>
-            <w:top w:w="0" w:type="dxa"/>
-            <w:bottom w:w="0" w:type="dxa"/>
-          </w:tblCellMar>
-        </w:tblPrEx>
         <w:trPr>
           <w:cantSplit/>
         </w:trPr>
@@ -6490,12 +5767,6 @@
         </w:tc>
       </w:tr>
       <w:tr>
-        <w:tblPrEx>
-          <w:tblCellMar>
-            <w:top w:w="0" w:type="dxa"/>
-            <w:bottom w:w="0" w:type="dxa"/>
-          </w:tblCellMar>
-        </w:tblPrEx>
         <w:trPr>
           <w:cantSplit/>
         </w:trPr>
@@ -6520,6 +5791,7 @@
               <w:spacing w:after="40"/>
             </w:pPr>
             <w:r>
+              <w:lastRenderedPageBreak/>
               <w:t>RF03</w:t>
             </w:r>
           </w:p>
@@ -6601,12 +5873,6 @@
         </w:tc>
       </w:tr>
       <w:tr>
-        <w:tblPrEx>
-          <w:tblCellMar>
-            <w:top w:w="0" w:type="dxa"/>
-            <w:bottom w:w="0" w:type="dxa"/>
-          </w:tblCellMar>
-        </w:tblPrEx>
         <w:trPr>
           <w:cantSplit/>
         </w:trPr>
@@ -6712,12 +5978,6 @@
         </w:tc>
       </w:tr>
       <w:tr>
-        <w:tblPrEx>
-          <w:tblCellMar>
-            <w:top w:w="0" w:type="dxa"/>
-            <w:bottom w:w="0" w:type="dxa"/>
-          </w:tblCellMar>
-        </w:tblPrEx>
         <w:trPr>
           <w:cantSplit/>
         </w:trPr>
@@ -6823,12 +6083,6 @@
         </w:tc>
       </w:tr>
       <w:tr>
-        <w:tblPrEx>
-          <w:tblCellMar>
-            <w:top w:w="0" w:type="dxa"/>
-            <w:bottom w:w="0" w:type="dxa"/>
-          </w:tblCellMar>
-        </w:tblPrEx>
         <w:trPr>
           <w:cantSplit/>
         </w:trPr>
@@ -6934,12 +6188,6 @@
         </w:tc>
       </w:tr>
       <w:tr>
-        <w:tblPrEx>
-          <w:tblCellMar>
-            <w:top w:w="0" w:type="dxa"/>
-            <w:bottom w:w="0" w:type="dxa"/>
-          </w:tblCellMar>
-        </w:tblPrEx>
         <w:trPr>
           <w:cantSplit/>
         </w:trPr>
@@ -7061,12 +6309,6 @@
         </w:tc>
       </w:tr>
       <w:tr>
-        <w:tblPrEx>
-          <w:tblCellMar>
-            <w:top w:w="0" w:type="dxa"/>
-            <w:bottom w:w="0" w:type="dxa"/>
-          </w:tblCellMar>
-        </w:tblPrEx>
         <w:trPr>
           <w:cantSplit/>
         </w:trPr>
@@ -7172,12 +6414,6 @@
         </w:tc>
       </w:tr>
       <w:tr>
-        <w:tblPrEx>
-          <w:tblCellMar>
-            <w:top w:w="0" w:type="dxa"/>
-            <w:bottom w:w="0" w:type="dxa"/>
-          </w:tblCellMar>
-        </w:tblPrEx>
         <w:trPr>
           <w:cantSplit/>
         </w:trPr>
@@ -7283,12 +6519,6 @@
         </w:tc>
       </w:tr>
       <w:tr>
-        <w:tblPrEx>
-          <w:tblCellMar>
-            <w:top w:w="0" w:type="dxa"/>
-            <w:bottom w:w="0" w:type="dxa"/>
-          </w:tblCellMar>
-        </w:tblPrEx>
         <w:trPr>
           <w:cantSplit/>
         </w:trPr>
@@ -7426,12 +6656,6 @@
         <w:gridCol w:w="10470"/>
       </w:tblGrid>
       <w:tr>
-        <w:tblPrEx>
-          <w:tblCellMar>
-            <w:top w:w="0" w:type="dxa"/>
-            <w:bottom w:w="0" w:type="dxa"/>
-          </w:tblCellMar>
-        </w:tblPrEx>
         <w:trPr>
           <w:cantSplit/>
           <w:tblHeader/>
@@ -7534,12 +6758,6 @@
         </w:tc>
       </w:tr>
       <w:tr>
-        <w:tblPrEx>
-          <w:tblCellMar>
-            <w:top w:w="0" w:type="dxa"/>
-            <w:bottom w:w="0" w:type="dxa"/>
-          </w:tblCellMar>
-        </w:tblPrEx>
         <w:trPr>
           <w:cantSplit/>
         </w:trPr>
@@ -7620,12 +6838,6 @@
         </w:tc>
       </w:tr>
       <w:tr>
-        <w:tblPrEx>
-          <w:tblCellMar>
-            <w:top w:w="0" w:type="dxa"/>
-            <w:bottom w:w="0" w:type="dxa"/>
-          </w:tblCellMar>
-        </w:tblPrEx>
         <w:trPr>
           <w:cantSplit/>
         </w:trPr>
@@ -7650,7 +6862,6 @@
               <w:spacing w:after="40"/>
             </w:pPr>
             <w:r>
-              <w:lastRenderedPageBreak/>
               <w:t>RNF02</w:t>
             </w:r>
           </w:p>
@@ -7707,12 +6918,6 @@
         </w:tc>
       </w:tr>
       <w:tr>
-        <w:tblPrEx>
-          <w:tblCellMar>
-            <w:top w:w="0" w:type="dxa"/>
-            <w:bottom w:w="0" w:type="dxa"/>
-          </w:tblCellMar>
-        </w:tblPrEx>
         <w:trPr>
           <w:cantSplit/>
         </w:trPr>
@@ -7793,12 +6998,6 @@
         </w:tc>
       </w:tr>
       <w:tr>
-        <w:tblPrEx>
-          <w:tblCellMar>
-            <w:top w:w="0" w:type="dxa"/>
-            <w:bottom w:w="0" w:type="dxa"/>
-          </w:tblCellMar>
-        </w:tblPrEx>
         <w:trPr>
           <w:cantSplit/>
         </w:trPr>
@@ -7885,6 +7084,7 @@
         <w:keepNext/>
       </w:pPr>
       <w:r>
+        <w:lastRenderedPageBreak/>
         <w:t>3.3 Matriz de rastreabilidade</w:t>
       </w:r>
     </w:p>
@@ -7922,12 +7122,6 @@
         <w:gridCol w:w="3400"/>
       </w:tblGrid>
       <w:tr>
-        <w:tblPrEx>
-          <w:tblCellMar>
-            <w:top w:w="0" w:type="dxa"/>
-            <w:bottom w:w="0" w:type="dxa"/>
-          </w:tblCellMar>
-        </w:tblPrEx>
         <w:trPr>
           <w:cantSplit/>
           <w:tblHeader/>
@@ -8126,12 +7320,6 @@
         </w:tc>
       </w:tr>
       <w:tr>
-        <w:tblPrEx>
-          <w:tblCellMar>
-            <w:top w:w="0" w:type="dxa"/>
-            <w:bottom w:w="0" w:type="dxa"/>
-          </w:tblCellMar>
-        </w:tblPrEx>
         <w:trPr>
           <w:cantSplit/>
         </w:trPr>
@@ -8295,12 +7483,6 @@
         </w:tc>
       </w:tr>
       <w:tr>
-        <w:tblPrEx>
-          <w:tblCellMar>
-            <w:top w:w="0" w:type="dxa"/>
-            <w:bottom w:w="0" w:type="dxa"/>
-          </w:tblCellMar>
-        </w:tblPrEx>
         <w:trPr>
           <w:cantSplit/>
         </w:trPr>
@@ -8472,12 +7654,6 @@
         </w:tc>
       </w:tr>
       <w:tr>
-        <w:tblPrEx>
-          <w:tblCellMar>
-            <w:top w:w="0" w:type="dxa"/>
-            <w:bottom w:w="0" w:type="dxa"/>
-          </w:tblCellMar>
-        </w:tblPrEx>
         <w:trPr>
           <w:cantSplit/>
         </w:trPr>
@@ -8649,12 +7825,6 @@
         </w:tc>
       </w:tr>
       <w:tr>
-        <w:tblPrEx>
-          <w:tblCellMar>
-            <w:top w:w="0" w:type="dxa"/>
-            <w:bottom w:w="0" w:type="dxa"/>
-          </w:tblCellMar>
-        </w:tblPrEx>
         <w:trPr>
           <w:cantSplit/>
         </w:trPr>
@@ -8810,12 +7980,6 @@
         </w:tc>
       </w:tr>
       <w:tr>
-        <w:tblPrEx>
-          <w:tblCellMar>
-            <w:top w:w="0" w:type="dxa"/>
-            <w:bottom w:w="0" w:type="dxa"/>
-          </w:tblCellMar>
-        </w:tblPrEx>
         <w:trPr>
           <w:cantSplit/>
         </w:trPr>
@@ -8840,7 +8004,6 @@
               <w:spacing w:after="40"/>
             </w:pPr>
             <w:r>
-              <w:lastRenderedPageBreak/>
               <w:t>RL02 e RL07</w:t>
             </w:r>
           </w:p>
@@ -8972,12 +8135,6 @@
         </w:tc>
       </w:tr>
       <w:tr>
-        <w:tblPrEx>
-          <w:tblCellMar>
-            <w:top w:w="0" w:type="dxa"/>
-            <w:bottom w:w="0" w:type="dxa"/>
-          </w:tblCellMar>
-        </w:tblPrEx>
         <w:trPr>
           <w:cantSplit/>
         </w:trPr>
@@ -9146,12 +8303,6 @@
         </w:tc>
       </w:tr>
       <w:tr>
-        <w:tblPrEx>
-          <w:tblCellMar>
-            <w:top w:w="0" w:type="dxa"/>
-            <w:bottom w:w="0" w:type="dxa"/>
-          </w:tblCellMar>
-        </w:tblPrEx>
         <w:trPr>
           <w:cantSplit/>
         </w:trPr>
@@ -9176,6 +8327,7 @@
               <w:spacing w:after="40"/>
             </w:pPr>
             <w:r>
+              <w:lastRenderedPageBreak/>
               <w:t>RL03, RL06 e RL02</w:t>
             </w:r>
           </w:p>
@@ -9320,12 +8472,6 @@
         </w:tc>
       </w:tr>
       <w:tr>
-        <w:tblPrEx>
-          <w:tblCellMar>
-            <w:top w:w="0" w:type="dxa"/>
-            <w:bottom w:w="0" w:type="dxa"/>
-          </w:tblCellMar>
-        </w:tblPrEx>
         <w:trPr>
           <w:cantSplit/>
         </w:trPr>
@@ -9481,12 +8627,6 @@
         </w:tc>
       </w:tr>
       <w:tr>
-        <w:tblPrEx>
-          <w:tblCellMar>
-            <w:top w:w="0" w:type="dxa"/>
-            <w:bottom w:w="0" w:type="dxa"/>
-          </w:tblCellMar>
-        </w:tblPrEx>
         <w:trPr>
           <w:cantSplit/>
         </w:trPr>
@@ -9642,12 +8782,6 @@
         </w:tc>
       </w:tr>
       <w:tr>
-        <w:tblPrEx>
-          <w:tblCellMar>
-            <w:top w:w="0" w:type="dxa"/>
-            <w:bottom w:w="0" w:type="dxa"/>
-          </w:tblCellMar>
-        </w:tblPrEx>
         <w:trPr>
           <w:cantSplit/>
         </w:trPr>
@@ -9803,12 +8937,6 @@
         </w:tc>
       </w:tr>
       <w:tr>
-        <w:tblPrEx>
-          <w:tblCellMar>
-            <w:top w:w="0" w:type="dxa"/>
-            <w:bottom w:w="0" w:type="dxa"/>
-          </w:tblCellMar>
-        </w:tblPrEx>
         <w:trPr>
           <w:cantSplit/>
         </w:trPr>
@@ -9964,12 +9092,6 @@
         </w:tc>
       </w:tr>
       <w:tr>
-        <w:tblPrEx>
-          <w:tblCellMar>
-            <w:top w:w="0" w:type="dxa"/>
-            <w:bottom w:w="0" w:type="dxa"/>
-          </w:tblCellMar>
-        </w:tblPrEx>
         <w:trPr>
           <w:cantSplit/>
         </w:trPr>
@@ -10131,7 +9253,6 @@
         <w:keepNext/>
       </w:pPr>
       <w:r>
-        <w:lastRenderedPageBreak/>
         <w:t>4. Revisão do campo de status (fase 2)</w:t>
       </w:r>
     </w:p>
@@ -10175,6 +9296,7 @@
         <w:spacing w:after="60"/>
       </w:pPr>
       <w:r>
+        <w:lastRenderedPageBreak/>
         <w:t>Troca é algo que acontece com um pedido já entregue, e não uma situação própria de um pedido novo.</w:t>
       </w:r>
     </w:p>
@@ -10231,12 +9353,6 @@
         <w:gridCol w:w="2000"/>
       </w:tblGrid>
       <w:tr>
-        <w:tblPrEx>
-          <w:tblCellMar>
-            <w:top w:w="0" w:type="dxa"/>
-            <w:bottom w:w="0" w:type="dxa"/>
-          </w:tblCellMar>
-        </w:tblPrEx>
         <w:trPr>
           <w:cantSplit/>
           <w:tblHeader/>
@@ -10339,12 +9455,6 @@
         </w:tc>
       </w:tr>
       <w:tr>
-        <w:tblPrEx>
-          <w:tblCellMar>
-            <w:top w:w="0" w:type="dxa"/>
-            <w:bottom w:w="0" w:type="dxa"/>
-          </w:tblCellMar>
-        </w:tblPrEx>
         <w:trPr>
           <w:cantSplit/>
         </w:trPr>
@@ -10425,12 +9535,6 @@
         </w:tc>
       </w:tr>
       <w:tr>
-        <w:tblPrEx>
-          <w:tblCellMar>
-            <w:top w:w="0" w:type="dxa"/>
-            <w:bottom w:w="0" w:type="dxa"/>
-          </w:tblCellMar>
-        </w:tblPrEx>
         <w:trPr>
           <w:cantSplit/>
         </w:trPr>
@@ -10511,12 +9615,6 @@
         </w:tc>
       </w:tr>
       <w:tr>
-        <w:tblPrEx>
-          <w:tblCellMar>
-            <w:top w:w="0" w:type="dxa"/>
-            <w:bottom w:w="0" w:type="dxa"/>
-          </w:tblCellMar>
-        </w:tblPrEx>
         <w:trPr>
           <w:cantSplit/>
         </w:trPr>
@@ -10597,12 +9695,6 @@
         </w:tc>
       </w:tr>
       <w:tr>
-        <w:tblPrEx>
-          <w:tblCellMar>
-            <w:top w:w="0" w:type="dxa"/>
-            <w:bottom w:w="0" w:type="dxa"/>
-          </w:tblCellMar>
-        </w:tblPrEx>
         <w:trPr>
           <w:cantSplit/>
         </w:trPr>
@@ -10723,12 +9815,6 @@
         <w:gridCol w:w="8570"/>
       </w:tblGrid>
       <w:tr>
-        <w:tblPrEx>
-          <w:tblCellMar>
-            <w:top w:w="0" w:type="dxa"/>
-            <w:bottom w:w="0" w:type="dxa"/>
-          </w:tblCellMar>
-        </w:tblPrEx>
         <w:trPr>
           <w:cantSplit/>
           <w:tblHeader/>
@@ -10831,12 +9917,6 @@
         </w:tc>
       </w:tr>
       <w:tr>
-        <w:tblPrEx>
-          <w:tblCellMar>
-            <w:top w:w="0" w:type="dxa"/>
-            <w:bottom w:w="0" w:type="dxa"/>
-          </w:tblCellMar>
-        </w:tblPrEx>
         <w:trPr>
           <w:cantSplit/>
         </w:trPr>
@@ -10917,12 +9997,6 @@
         </w:tc>
       </w:tr>
       <w:tr>
-        <w:tblPrEx>
-          <w:tblCellMar>
-            <w:top w:w="0" w:type="dxa"/>
-            <w:bottom w:w="0" w:type="dxa"/>
-          </w:tblCellMar>
-        </w:tblPrEx>
         <w:trPr>
           <w:cantSplit/>
         </w:trPr>
@@ -11003,12 +10077,6 @@
         </w:tc>
       </w:tr>
       <w:tr>
-        <w:tblPrEx>
-          <w:tblCellMar>
-            <w:top w:w="0" w:type="dxa"/>
-            <w:bottom w:w="0" w:type="dxa"/>
-          </w:tblCellMar>
-        </w:tblPrEx>
         <w:trPr>
           <w:cantSplit/>
         </w:trPr>
@@ -11095,7 +10163,6 @@
         <w:keepNext/>
       </w:pPr>
       <w:r>
-        <w:lastRenderedPageBreak/>
         <w:t>4.4 Como evitar estados inconsistentes</w:t>
       </w:r>
     </w:p>
@@ -11179,12 +10246,6 @@
         <w:gridCol w:w="4570"/>
       </w:tblGrid>
       <w:tr>
-        <w:tblPrEx>
-          <w:tblCellMar>
-            <w:top w:w="0" w:type="dxa"/>
-            <w:bottom w:w="0" w:type="dxa"/>
-          </w:tblCellMar>
-        </w:tblPrEx>
         <w:trPr>
           <w:cantSplit/>
           <w:tblHeader/>
@@ -11287,12 +10348,6 @@
         </w:tc>
       </w:tr>
       <w:tr>
-        <w:tblPrEx>
-          <w:tblCellMar>
-            <w:top w:w="0" w:type="dxa"/>
-            <w:bottom w:w="0" w:type="dxa"/>
-          </w:tblCellMar>
-        </w:tblPrEx>
         <w:trPr>
           <w:cantSplit/>
         </w:trPr>
@@ -11373,12 +10428,6 @@
         </w:tc>
       </w:tr>
       <w:tr>
-        <w:tblPrEx>
-          <w:tblCellMar>
-            <w:top w:w="0" w:type="dxa"/>
-            <w:bottom w:w="0" w:type="dxa"/>
-          </w:tblCellMar>
-        </w:tblPrEx>
         <w:trPr>
           <w:cantSplit/>
         </w:trPr>
@@ -11403,6 +10452,7 @@
               <w:spacing w:after="40"/>
             </w:pPr>
             <w:r>
+              <w:lastRenderedPageBreak/>
               <w:t>Entregue</w:t>
             </w:r>
           </w:p>
@@ -11459,12 +10509,6 @@
         </w:tc>
       </w:tr>
       <w:tr>
-        <w:tblPrEx>
-          <w:tblCellMar>
-            <w:top w:w="0" w:type="dxa"/>
-            <w:bottom w:w="0" w:type="dxa"/>
-          </w:tblCellMar>
-        </w:tblPrEx>
         <w:trPr>
           <w:cantSplit/>
         </w:trPr>
@@ -11545,12 +10589,6 @@
         </w:tc>
       </w:tr>
       <w:tr>
-        <w:tblPrEx>
-          <w:tblCellMar>
-            <w:top w:w="0" w:type="dxa"/>
-            <w:bottom w:w="0" w:type="dxa"/>
-          </w:tblCellMar>
-        </w:tblPrEx>
         <w:trPr>
           <w:cantSplit/>
         </w:trPr>
@@ -11898,12 +10936,6 @@
         <w:gridCol w:w="2938"/>
       </w:tblGrid>
       <w:tr>
-        <w:tblPrEx>
-          <w:tblCellMar>
-            <w:top w:w="0" w:type="dxa"/>
-            <w:bottom w:w="0" w:type="dxa"/>
-          </w:tblCellMar>
-        </w:tblPrEx>
         <w:trPr>
           <w:cantSplit/>
           <w:tblHeader/>
@@ -12006,12 +11038,6 @@
         </w:tc>
       </w:tr>
       <w:tr>
-        <w:tblPrEx>
-          <w:tblCellMar>
-            <w:top w:w="0" w:type="dxa"/>
-            <w:bottom w:w="0" w:type="dxa"/>
-          </w:tblCellMar>
-        </w:tblPrEx>
         <w:trPr>
           <w:cantSplit/>
         </w:trPr>
@@ -12134,12 +11160,6 @@
         </w:tc>
       </w:tr>
       <w:tr>
-        <w:tblPrEx>
-          <w:tblCellMar>
-            <w:top w:w="0" w:type="dxa"/>
-            <w:bottom w:w="0" w:type="dxa"/>
-          </w:tblCellMar>
-        </w:tblPrEx>
         <w:trPr>
           <w:cantSplit/>
         </w:trPr>
@@ -12278,12 +11298,6 @@
         </w:tc>
       </w:tr>
       <w:tr>
-        <w:tblPrEx>
-          <w:tblCellMar>
-            <w:top w:w="0" w:type="dxa"/>
-            <w:bottom w:w="0" w:type="dxa"/>
-          </w:tblCellMar>
-        </w:tblPrEx>
         <w:trPr>
           <w:cantSplit/>
         </w:trPr>
@@ -12379,12 +11393,6 @@
         </w:tc>
       </w:tr>
       <w:tr>
-        <w:tblPrEx>
-          <w:tblCellMar>
-            <w:top w:w="0" w:type="dxa"/>
-            <w:bottom w:w="0" w:type="dxa"/>
-          </w:tblCellMar>
-        </w:tblPrEx>
         <w:trPr>
           <w:cantSplit/>
         </w:trPr>
@@ -12523,12 +11531,6 @@
         </w:tc>
       </w:tr>
       <w:tr>
-        <w:tblPrEx>
-          <w:tblCellMar>
-            <w:top w:w="0" w:type="dxa"/>
-            <w:bottom w:w="0" w:type="dxa"/>
-          </w:tblCellMar>
-        </w:tblPrEx>
         <w:trPr>
           <w:cantSplit/>
         </w:trPr>
@@ -12619,12 +11621,6 @@
         </w:tc>
       </w:tr>
       <w:tr>
-        <w:tblPrEx>
-          <w:tblCellMar>
-            <w:top w:w="0" w:type="dxa"/>
-            <w:bottom w:w="0" w:type="dxa"/>
-          </w:tblCellMar>
-        </w:tblPrEx>
         <w:trPr>
           <w:cantSplit/>
         </w:trPr>
@@ -12705,12 +11701,6 @@
         </w:tc>
       </w:tr>
       <w:tr>
-        <w:tblPrEx>
-          <w:tblCellMar>
-            <w:top w:w="0" w:type="dxa"/>
-            <w:bottom w:w="0" w:type="dxa"/>
-          </w:tblCellMar>
-        </w:tblPrEx>
         <w:trPr>
           <w:cantSplit/>
         </w:trPr>
@@ -12796,12 +11786,6 @@
         </w:tc>
       </w:tr>
       <w:tr>
-        <w:tblPrEx>
-          <w:tblCellMar>
-            <w:top w:w="0" w:type="dxa"/>
-            <w:bottom w:w="0" w:type="dxa"/>
-          </w:tblCellMar>
-        </w:tblPrEx>
         <w:trPr>
           <w:cantSplit/>
         </w:trPr>
@@ -12882,12 +11866,6 @@
         </w:tc>
       </w:tr>
       <w:tr>
-        <w:tblPrEx>
-          <w:tblCellMar>
-            <w:top w:w="0" w:type="dxa"/>
-            <w:bottom w:w="0" w:type="dxa"/>
-          </w:tblCellMar>
-        </w:tblPrEx>
         <w:trPr>
           <w:cantSplit/>
         </w:trPr>
@@ -13000,12 +11978,6 @@
         <w:gridCol w:w="4438"/>
       </w:tblGrid>
       <w:tr>
-        <w:tblPrEx>
-          <w:tblCellMar>
-            <w:top w:w="0" w:type="dxa"/>
-            <w:bottom w:w="0" w:type="dxa"/>
-          </w:tblCellMar>
-        </w:tblPrEx>
         <w:trPr>
           <w:cantSplit/>
           <w:tblHeader/>
@@ -13108,12 +12080,6 @@
         </w:tc>
       </w:tr>
       <w:tr>
-        <w:tblPrEx>
-          <w:tblCellMar>
-            <w:top w:w="0" w:type="dxa"/>
-            <w:bottom w:w="0" w:type="dxa"/>
-          </w:tblCellMar>
-        </w:tblPrEx>
         <w:trPr>
           <w:cantSplit/>
         </w:trPr>
@@ -13199,12 +12165,6 @@
         </w:tc>
       </w:tr>
       <w:tr>
-        <w:tblPrEx>
-          <w:tblCellMar>
-            <w:top w:w="0" w:type="dxa"/>
-            <w:bottom w:w="0" w:type="dxa"/>
-          </w:tblCellMar>
-        </w:tblPrEx>
         <w:trPr>
           <w:cantSplit/>
         </w:trPr>
@@ -13290,12 +12250,6 @@
         </w:tc>
       </w:tr>
       <w:tr>
-        <w:tblPrEx>
-          <w:tblCellMar>
-            <w:top w:w="0" w:type="dxa"/>
-            <w:bottom w:w="0" w:type="dxa"/>
-          </w:tblCellMar>
-        </w:tblPrEx>
         <w:trPr>
           <w:cantSplit/>
         </w:trPr>
@@ -13406,12 +12360,6 @@
         </w:tc>
       </w:tr>
       <w:tr>
-        <w:tblPrEx>
-          <w:tblCellMar>
-            <w:top w:w="0" w:type="dxa"/>
-            <w:bottom w:w="0" w:type="dxa"/>
-          </w:tblCellMar>
-        </w:tblPrEx>
         <w:trPr>
           <w:cantSplit/>
         </w:trPr>
@@ -13508,12 +12456,6 @@
         </w:tc>
       </w:tr>
       <w:tr>
-        <w:tblPrEx>
-          <w:tblCellMar>
-            <w:top w:w="0" w:type="dxa"/>
-            <w:bottom w:w="0" w:type="dxa"/>
-          </w:tblCellMar>
-        </w:tblPrEx>
         <w:trPr>
           <w:cantSplit/>
         </w:trPr>
@@ -13604,12 +12546,6 @@
         </w:tc>
       </w:tr>
       <w:tr>
-        <w:tblPrEx>
-          <w:tblCellMar>
-            <w:top w:w="0" w:type="dxa"/>
-            <w:bottom w:w="0" w:type="dxa"/>
-          </w:tblCellMar>
-        </w:tblPrEx>
         <w:trPr>
           <w:cantSplit/>
         </w:trPr>
@@ -13754,12 +12690,6 @@
         <w:gridCol w:w="3926"/>
       </w:tblGrid>
       <w:tr>
-        <w:tblPrEx>
-          <w:tblCellMar>
-            <w:top w:w="0" w:type="dxa"/>
-            <w:bottom w:w="0" w:type="dxa"/>
-          </w:tblCellMar>
-        </w:tblPrEx>
         <w:trPr>
           <w:cantSplit/>
           <w:tblHeader/>
@@ -13862,12 +12792,6 @@
         </w:tc>
       </w:tr>
       <w:tr>
-        <w:tblPrEx>
-          <w:tblCellMar>
-            <w:top w:w="0" w:type="dxa"/>
-            <w:bottom w:w="0" w:type="dxa"/>
-          </w:tblCellMar>
-        </w:tblPrEx>
         <w:trPr>
           <w:cantSplit/>
         </w:trPr>
@@ -13998,12 +12922,6 @@
         </w:tc>
       </w:tr>
       <w:tr>
-        <w:tblPrEx>
-          <w:tblCellMar>
-            <w:top w:w="0" w:type="dxa"/>
-            <w:bottom w:w="0" w:type="dxa"/>
-          </w:tblCellMar>
-        </w:tblPrEx>
         <w:trPr>
           <w:cantSplit/>
         </w:trPr>
@@ -14102,12 +13020,6 @@
         </w:tc>
       </w:tr>
       <w:tr>
-        <w:tblPrEx>
-          <w:tblCellMar>
-            <w:top w:w="0" w:type="dxa"/>
-            <w:bottom w:w="0" w:type="dxa"/>
-          </w:tblCellMar>
-        </w:tblPrEx>
         <w:trPr>
           <w:cantSplit/>
         </w:trPr>
@@ -14246,12 +13158,6 @@
         </w:tc>
       </w:tr>
       <w:tr>
-        <w:tblPrEx>
-          <w:tblCellMar>
-            <w:top w:w="0" w:type="dxa"/>
-            <w:bottom w:w="0" w:type="dxa"/>
-          </w:tblCellMar>
-        </w:tblPrEx>
         <w:trPr>
           <w:cantSplit/>
         </w:trPr>
@@ -14390,12 +13296,6 @@
         </w:tc>
       </w:tr>
       <w:tr>
-        <w:tblPrEx>
-          <w:tblCellMar>
-            <w:top w:w="0" w:type="dxa"/>
-            <w:bottom w:w="0" w:type="dxa"/>
-          </w:tblCellMar>
-        </w:tblPrEx>
         <w:trPr>
           <w:cantSplit/>
         </w:trPr>
@@ -14536,12 +13436,6 @@
         <w:gridCol w:w="4538"/>
       </w:tblGrid>
       <w:tr>
-        <w:tblPrEx>
-          <w:tblCellMar>
-            <w:top w:w="0" w:type="dxa"/>
-            <w:bottom w:w="0" w:type="dxa"/>
-          </w:tblCellMar>
-        </w:tblPrEx>
         <w:trPr>
           <w:cantSplit/>
           <w:tblHeader/>
@@ -14644,12 +13538,6 @@
         </w:tc>
       </w:tr>
       <w:tr>
-        <w:tblPrEx>
-          <w:tblCellMar>
-            <w:top w:w="0" w:type="dxa"/>
-            <w:bottom w:w="0" w:type="dxa"/>
-          </w:tblCellMar>
-        </w:tblPrEx>
         <w:trPr>
           <w:cantSplit/>
         </w:trPr>
@@ -14730,12 +13618,6 @@
         </w:tc>
       </w:tr>
       <w:tr>
-        <w:tblPrEx>
-          <w:tblCellMar>
-            <w:top w:w="0" w:type="dxa"/>
-            <w:bottom w:w="0" w:type="dxa"/>
-          </w:tblCellMar>
-        </w:tblPrEx>
         <w:trPr>
           <w:cantSplit/>
         </w:trPr>
@@ -14817,12 +13699,6 @@
         </w:tc>
       </w:tr>
       <w:tr>
-        <w:tblPrEx>
-          <w:tblCellMar>
-            <w:top w:w="0" w:type="dxa"/>
-            <w:bottom w:w="0" w:type="dxa"/>
-          </w:tblCellMar>
-        </w:tblPrEx>
         <w:trPr>
           <w:cantSplit/>
         </w:trPr>
@@ -14903,12 +13779,6 @@
         </w:tc>
       </w:tr>
       <w:tr>
-        <w:tblPrEx>
-          <w:tblCellMar>
-            <w:top w:w="0" w:type="dxa"/>
-            <w:bottom w:w="0" w:type="dxa"/>
-          </w:tblCellMar>
-        </w:tblPrEx>
         <w:trPr>
           <w:cantSplit/>
         </w:trPr>
@@ -14989,12 +13859,6 @@
         </w:tc>
       </w:tr>
       <w:tr>
-        <w:tblPrEx>
-          <w:tblCellMar>
-            <w:top w:w="0" w:type="dxa"/>
-            <w:bottom w:w="0" w:type="dxa"/>
-          </w:tblCellMar>
-        </w:tblPrEx>
         <w:trPr>
           <w:cantSplit/>
         </w:trPr>
@@ -15083,12 +13947,6 @@
         </w:tc>
       </w:tr>
       <w:tr>
-        <w:tblPrEx>
-          <w:tblCellMar>
-            <w:top w:w="0" w:type="dxa"/>
-            <w:bottom w:w="0" w:type="dxa"/>
-          </w:tblCellMar>
-        </w:tblPrEx>
         <w:trPr>
           <w:cantSplit/>
         </w:trPr>
@@ -15647,12 +14505,6 @@
         <w:gridCol w:w="3938"/>
       </w:tblGrid>
       <w:tr>
-        <w:tblPrEx>
-          <w:tblCellMar>
-            <w:top w:w="0" w:type="dxa"/>
-            <w:bottom w:w="0" w:type="dxa"/>
-          </w:tblCellMar>
-        </w:tblPrEx>
         <w:trPr>
           <w:cantSplit/>
           <w:tblHeader/>
@@ -15755,12 +14607,6 @@
         </w:tc>
       </w:tr>
       <w:tr>
-        <w:tblPrEx>
-          <w:tblCellMar>
-            <w:top w:w="0" w:type="dxa"/>
-            <w:bottom w:w="0" w:type="dxa"/>
-          </w:tblCellMar>
-        </w:tblPrEx>
         <w:trPr>
           <w:cantSplit/>
         </w:trPr>
@@ -15841,12 +14687,6 @@
         </w:tc>
       </w:tr>
       <w:tr>
-        <w:tblPrEx>
-          <w:tblCellMar>
-            <w:top w:w="0" w:type="dxa"/>
-            <w:bottom w:w="0" w:type="dxa"/>
-          </w:tblCellMar>
-        </w:tblPrEx>
         <w:trPr>
           <w:cantSplit/>
         </w:trPr>
@@ -15927,12 +14767,6 @@
         </w:tc>
       </w:tr>
       <w:tr>
-        <w:tblPrEx>
-          <w:tblCellMar>
-            <w:top w:w="0" w:type="dxa"/>
-            <w:bottom w:w="0" w:type="dxa"/>
-          </w:tblCellMar>
-        </w:tblPrEx>
         <w:trPr>
           <w:cantSplit/>
         </w:trPr>
@@ -16169,12 +15003,6 @@
         <w:gridCol w:w="5638"/>
       </w:tblGrid>
       <w:tr>
-        <w:tblPrEx>
-          <w:tblCellMar>
-            <w:top w:w="0" w:type="dxa"/>
-            <w:bottom w:w="0" w:type="dxa"/>
-          </w:tblCellMar>
-        </w:tblPrEx>
         <w:trPr>
           <w:cantSplit/>
           <w:tblHeader/>
@@ -16245,12 +15073,6 @@
         </w:tc>
       </w:tr>
       <w:tr>
-        <w:tblPrEx>
-          <w:tblCellMar>
-            <w:top w:w="0" w:type="dxa"/>
-            <w:bottom w:w="0" w:type="dxa"/>
-          </w:tblCellMar>
-        </w:tblPrEx>
         <w:trPr>
           <w:cantSplit/>
         </w:trPr>
@@ -16306,12 +15128,6 @@
         </w:tc>
       </w:tr>
       <w:tr>
-        <w:tblPrEx>
-          <w:tblCellMar>
-            <w:top w:w="0" w:type="dxa"/>
-            <w:bottom w:w="0" w:type="dxa"/>
-          </w:tblCellMar>
-        </w:tblPrEx>
         <w:trPr>
           <w:cantSplit/>
         </w:trPr>
@@ -16367,12 +15183,6 @@
         </w:tc>
       </w:tr>
       <w:tr>
-        <w:tblPrEx>
-          <w:tblCellMar>
-            <w:top w:w="0" w:type="dxa"/>
-            <w:bottom w:w="0" w:type="dxa"/>
-          </w:tblCellMar>
-        </w:tblPrEx>
         <w:trPr>
           <w:cantSplit/>
         </w:trPr>
@@ -16428,12 +15238,6 @@
         </w:tc>
       </w:tr>
       <w:tr>
-        <w:tblPrEx>
-          <w:tblCellMar>
-            <w:top w:w="0" w:type="dxa"/>
-            <w:bottom w:w="0" w:type="dxa"/>
-          </w:tblCellMar>
-        </w:tblPrEx>
         <w:trPr>
           <w:cantSplit/>
         </w:trPr>
@@ -16495,12 +15299,6 @@
         </w:tc>
       </w:tr>
       <w:tr>
-        <w:tblPrEx>
-          <w:tblCellMar>
-            <w:top w:w="0" w:type="dxa"/>
-            <w:bottom w:w="0" w:type="dxa"/>
-          </w:tblCellMar>
-        </w:tblPrEx>
         <w:trPr>
           <w:cantSplit/>
         </w:trPr>
@@ -16561,12 +15359,6 @@
         </w:tc>
       </w:tr>
       <w:tr>
-        <w:tblPrEx>
-          <w:tblCellMar>
-            <w:top w:w="0" w:type="dxa"/>
-            <w:bottom w:w="0" w:type="dxa"/>
-          </w:tblCellMar>
-        </w:tblPrEx>
         <w:trPr>
           <w:cantSplit/>
         </w:trPr>
@@ -16638,12 +15430,6 @@
         </w:tc>
       </w:tr>
       <w:tr>
-        <w:tblPrEx>
-          <w:tblCellMar>
-            <w:top w:w="0" w:type="dxa"/>
-            <w:bottom w:w="0" w:type="dxa"/>
-          </w:tblCellMar>
-        </w:tblPrEx>
         <w:trPr>
           <w:cantSplit/>
         </w:trPr>
@@ -16753,12 +15539,6 @@
         <w:gridCol w:w="3370"/>
       </w:tblGrid>
       <w:tr>
-        <w:tblPrEx>
-          <w:tblCellMar>
-            <w:top w:w="0" w:type="dxa"/>
-            <w:bottom w:w="0" w:type="dxa"/>
-          </w:tblCellMar>
-        </w:tblPrEx>
         <w:trPr>
           <w:cantSplit/>
           <w:tblHeader/>
@@ -16925,12 +15705,6 @@
         </w:tc>
       </w:tr>
       <w:tr>
-        <w:tblPrEx>
-          <w:tblCellMar>
-            <w:top w:w="0" w:type="dxa"/>
-            <w:bottom w:w="0" w:type="dxa"/>
-          </w:tblCellMar>
-        </w:tblPrEx>
         <w:trPr>
           <w:cantSplit/>
         </w:trPr>
@@ -17005,7 +15779,7 @@
               <w:spacing w:after="40"/>
             </w:pPr>
             <w:r>
-              <w:t>PostgreSQL, MySQL, banco em memória</w:t>
+              <w:t>banco em memória</w:t>
             </w:r>
           </w:p>
         </w:tc>
@@ -17061,12 +15835,6 @@
         </w:tc>
       </w:tr>
       <w:tr>
-        <w:tblPrEx>
-          <w:tblCellMar>
-            <w:top w:w="0" w:type="dxa"/>
-            <w:bottom w:w="0" w:type="dxa"/>
-          </w:tblCellMar>
-        </w:tblPrEx>
         <w:trPr>
           <w:cantSplit/>
         </w:trPr>
@@ -17218,12 +15986,6 @@
         </w:tc>
       </w:tr>
       <w:tr>
-        <w:tblPrEx>
-          <w:tblCellMar>
-            <w:top w:w="0" w:type="dxa"/>
-            <w:bottom w:w="0" w:type="dxa"/>
-          </w:tblCellMar>
-        </w:tblPrEx>
         <w:trPr>
           <w:cantSplit/>
         </w:trPr>
@@ -17362,12 +16124,6 @@
         </w:tc>
       </w:tr>
       <w:tr>
-        <w:tblPrEx>
-          <w:tblCellMar>
-            <w:top w:w="0" w:type="dxa"/>
-            <w:bottom w:w="0" w:type="dxa"/>
-          </w:tblCellMar>
-        </w:tblPrEx>
         <w:trPr>
           <w:cantSplit/>
         </w:trPr>
@@ -17442,7 +16198,10 @@
               <w:spacing w:after="40"/>
             </w:pPr>
             <w:r>
-              <w:t>Tabela própria, dentro de Produto</w:t>
+              <w:t>Dentro</w:t>
+            </w:r>
+            <w:r>
+              <w:t xml:space="preserve"> de Produto</w:t>
             </w:r>
           </w:p>
         </w:tc>
@@ -17498,12 +16257,6 @@
         </w:tc>
       </w:tr>
       <w:tr>
-        <w:tblPrEx>
-          <w:tblCellMar>
-            <w:top w:w="0" w:type="dxa"/>
-            <w:bottom w:w="0" w:type="dxa"/>
-          </w:tblCellMar>
-        </w:tblPrEx>
         <w:trPr>
           <w:cantSplit/>
         </w:trPr>
@@ -17578,7 +16331,10 @@
               <w:spacing w:after="40"/>
             </w:pPr>
             <w:r>
-              <w:t>Dentro do pedido, ligada ao cliente</w:t>
+              <w:t>L</w:t>
+            </w:r>
+            <w:r>
+              <w:t>igada ao cliente</w:t>
             </w:r>
           </w:p>
         </w:tc>
@@ -17634,12 +16390,6 @@
         </w:tc>
       </w:tr>
       <w:tr>
-        <w:tblPrEx>
-          <w:tblCellMar>
-            <w:top w:w="0" w:type="dxa"/>
-            <w:bottom w:w="0" w:type="dxa"/>
-          </w:tblCellMar>
-        </w:tblPrEx>
         <w:trPr>
           <w:cantSplit/>
         </w:trPr>
@@ -17714,7 +16464,7 @@
               <w:spacing w:after="40"/>
             </w:pPr>
             <w:r>
-              <w:t>Texto livre, enum com CHECK, tabela de status</w:t>
+              <w:t xml:space="preserve">enum </w:t>
             </w:r>
           </w:p>
         </w:tc>
@@ -17770,12 +16520,6 @@
         </w:tc>
       </w:tr>
       <w:tr>
-        <w:tblPrEx>
-          <w:tblCellMar>
-            <w:top w:w="0" w:type="dxa"/>
-            <w:bottom w:w="0" w:type="dxa"/>
-          </w:tblCellMar>
-        </w:tblPrEx>
         <w:trPr>
           <w:cantSplit/>
         </w:trPr>
@@ -17850,7 +16594,7 @@
               <w:spacing w:after="40"/>
             </w:pPr>
             <w:r>
-              <w:t>Texto livre, enum com CHECK</w:t>
+              <w:t>enum</w:t>
             </w:r>
           </w:p>
         </w:tc>
@@ -17919,12 +16663,6 @@
         </w:tc>
       </w:tr>
       <w:tr>
-        <w:tblPrEx>
-          <w:tblCellMar>
-            <w:top w:w="0" w:type="dxa"/>
-            <w:bottom w:w="0" w:type="dxa"/>
-          </w:tblCellMar>
-        </w:tblPrEx>
         <w:trPr>
           <w:cantSplit/>
         </w:trPr>
@@ -17949,7 +16687,6 @@
               <w:spacing w:after="40"/>
             </w:pPr>
             <w:r>
-              <w:lastRenderedPageBreak/>
               <w:t>D8</w:t>
             </w:r>
           </w:p>
@@ -18056,12 +16793,6 @@
         </w:tc>
       </w:tr>
       <w:tr>
-        <w:tblPrEx>
-          <w:tblCellMar>
-            <w:top w:w="0" w:type="dxa"/>
-            <w:bottom w:w="0" w:type="dxa"/>
-          </w:tblCellMar>
-        </w:tblPrEx>
         <w:trPr>
           <w:cantSplit/>
         </w:trPr>
@@ -18086,6 +16817,7 @@
               <w:spacing w:after="40"/>
             </w:pPr>
             <w:r>
+              <w:lastRenderedPageBreak/>
               <w:t>D9</w:t>
             </w:r>
           </w:p>
@@ -18200,12 +16932,6 @@
         </w:tc>
       </w:tr>
       <w:tr>
-        <w:tblPrEx>
-          <w:tblCellMar>
-            <w:top w:w="0" w:type="dxa"/>
-            <w:bottom w:w="0" w:type="dxa"/>
-          </w:tblCellMar>
-        </w:tblPrEx>
         <w:trPr>
           <w:cantSplit/>
         </w:trPr>
@@ -18346,12 +17072,6 @@
         </w:tc>
       </w:tr>
       <w:tr>
-        <w:tblPrEx>
-          <w:tblCellMar>
-            <w:top w:w="0" w:type="dxa"/>
-            <w:bottom w:w="0" w:type="dxa"/>
-          </w:tblCellMar>
-        </w:tblPrEx>
         <w:trPr>
           <w:cantSplit/>
         </w:trPr>
@@ -18482,12 +17202,6 @@
         </w:tc>
       </w:tr>
       <w:tr>
-        <w:tblPrEx>
-          <w:tblCellMar>
-            <w:top w:w="0" w:type="dxa"/>
-            <w:bottom w:w="0" w:type="dxa"/>
-          </w:tblCellMar>
-        </w:tblPrEx>
         <w:trPr>
           <w:cantSplit/>
         </w:trPr>
@@ -18626,12 +17340,6 @@
         </w:tc>
       </w:tr>
       <w:tr>
-        <w:tblPrEx>
-          <w:tblCellMar>
-            <w:top w:w="0" w:type="dxa"/>
-            <w:bottom w:w="0" w:type="dxa"/>
-          </w:tblCellMar>
-        </w:tblPrEx>
         <w:trPr>
           <w:cantSplit/>
         </w:trPr>
@@ -18809,12 +17517,6 @@
         <w:gridCol w:w="4770"/>
       </w:tblGrid>
       <w:tr>
-        <w:tblPrEx>
-          <w:tblCellMar>
-            <w:top w:w="0" w:type="dxa"/>
-            <w:bottom w:w="0" w:type="dxa"/>
-          </w:tblCellMar>
-        </w:tblPrEx>
         <w:trPr>
           <w:cantSplit/>
           <w:tblHeader/>
@@ -18949,12 +17651,6 @@
         </w:tc>
       </w:tr>
       <w:tr>
-        <w:tblPrEx>
-          <w:tblCellMar>
-            <w:top w:w="0" w:type="dxa"/>
-            <w:bottom w:w="0" w:type="dxa"/>
-          </w:tblCellMar>
-        </w:tblPrEx>
         <w:trPr>
           <w:cantSplit/>
         </w:trPr>
@@ -19064,12 +17760,6 @@
         </w:tc>
       </w:tr>
       <w:tr>
-        <w:tblPrEx>
-          <w:tblCellMar>
-            <w:top w:w="0" w:type="dxa"/>
-            <w:bottom w:w="0" w:type="dxa"/>
-          </w:tblCellMar>
-        </w:tblPrEx>
         <w:trPr>
           <w:cantSplit/>
         </w:trPr>
@@ -19179,12 +17869,6 @@
         </w:tc>
       </w:tr>
       <w:tr>
-        <w:tblPrEx>
-          <w:tblCellMar>
-            <w:top w:w="0" w:type="dxa"/>
-            <w:bottom w:w="0" w:type="dxa"/>
-          </w:tblCellMar>
-        </w:tblPrEx>
         <w:trPr>
           <w:cantSplit/>
         </w:trPr>
@@ -19294,12 +17978,6 @@
         </w:tc>
       </w:tr>
       <w:tr>
-        <w:tblPrEx>
-          <w:tblCellMar>
-            <w:top w:w="0" w:type="dxa"/>
-            <w:bottom w:w="0" w:type="dxa"/>
-          </w:tblCellMar>
-        </w:tblPrEx>
         <w:trPr>
           <w:cantSplit/>
         </w:trPr>
@@ -19407,12 +18085,6 @@
         </w:tc>
       </w:tr>
       <w:tr>
-        <w:tblPrEx>
-          <w:tblCellMar>
-            <w:top w:w="0" w:type="dxa"/>
-            <w:bottom w:w="0" w:type="dxa"/>
-          </w:tblCellMar>
-        </w:tblPrEx>
         <w:trPr>
           <w:cantSplit/>
         </w:trPr>
@@ -19522,12 +18194,6 @@
         </w:tc>
       </w:tr>
       <w:tr>
-        <w:tblPrEx>
-          <w:tblCellMar>
-            <w:top w:w="0" w:type="dxa"/>
-            <w:bottom w:w="0" w:type="dxa"/>
-          </w:tblCellMar>
-        </w:tblPrEx>
         <w:trPr>
           <w:cantSplit/>
         </w:trPr>
@@ -19642,12 +18308,6 @@
         </w:tc>
       </w:tr>
       <w:tr>
-        <w:tblPrEx>
-          <w:tblCellMar>
-            <w:top w:w="0" w:type="dxa"/>
-            <w:bottom w:w="0" w:type="dxa"/>
-          </w:tblCellMar>
-        </w:tblPrEx>
         <w:trPr>
           <w:cantSplit/>
         </w:trPr>
@@ -19762,12 +18422,6 @@
         </w:tc>
       </w:tr>
       <w:tr>
-        <w:tblPrEx>
-          <w:tblCellMar>
-            <w:top w:w="0" w:type="dxa"/>
-            <w:bottom w:w="0" w:type="dxa"/>
-          </w:tblCellMar>
-        </w:tblPrEx>
         <w:trPr>
           <w:cantSplit/>
         </w:trPr>
@@ -19882,12 +18536,6 @@
         </w:tc>
       </w:tr>
       <w:tr>
-        <w:tblPrEx>
-          <w:tblCellMar>
-            <w:top w:w="0" w:type="dxa"/>
-            <w:bottom w:w="0" w:type="dxa"/>
-          </w:tblCellMar>
-        </w:tblPrEx>
         <w:trPr>
           <w:cantSplit/>
         </w:trPr>
@@ -20002,12 +18650,6 @@
         </w:tc>
       </w:tr>
       <w:tr>
-        <w:tblPrEx>
-          <w:tblCellMar>
-            <w:top w:w="0" w:type="dxa"/>
-            <w:bottom w:w="0" w:type="dxa"/>
-          </w:tblCellMar>
-        </w:tblPrEx>
         <w:trPr>
           <w:cantSplit/>
         </w:trPr>
@@ -20117,12 +18759,6 @@
         </w:tc>
       </w:tr>
       <w:tr>
-        <w:tblPrEx>
-          <w:tblCellMar>
-            <w:top w:w="0" w:type="dxa"/>
-            <w:bottom w:w="0" w:type="dxa"/>
-          </w:tblCellMar>
-        </w:tblPrEx>
         <w:trPr>
           <w:cantSplit/>
         </w:trPr>
@@ -20240,12 +18876,6 @@
         </w:tc>
       </w:tr>
       <w:tr>
-        <w:tblPrEx>
-          <w:tblCellMar>
-            <w:top w:w="0" w:type="dxa"/>
-            <w:bottom w:w="0" w:type="dxa"/>
-          </w:tblCellMar>
-        </w:tblPrEx>
         <w:trPr>
           <w:cantSplit/>
         </w:trPr>
@@ -20360,12 +18990,6 @@
         </w:tc>
       </w:tr>
       <w:tr>
-        <w:tblPrEx>
-          <w:tblCellMar>
-            <w:top w:w="0" w:type="dxa"/>
-            <w:bottom w:w="0" w:type="dxa"/>
-          </w:tblCellMar>
-        </w:tblPrEx>
         <w:trPr>
           <w:cantSplit/>
         </w:trPr>
@@ -20475,12 +19099,6 @@
         </w:tc>
       </w:tr>
       <w:tr>
-        <w:tblPrEx>
-          <w:tblCellMar>
-            <w:top w:w="0" w:type="dxa"/>
-            <w:bottom w:w="0" w:type="dxa"/>
-          </w:tblCellMar>
-        </w:tblPrEx>
         <w:trPr>
           <w:cantSplit/>
         </w:trPr>
@@ -20590,12 +19208,6 @@
         </w:tc>
       </w:tr>
       <w:tr>
-        <w:tblPrEx>
-          <w:tblCellMar>
-            <w:top w:w="0" w:type="dxa"/>
-            <w:bottom w:w="0" w:type="dxa"/>
-          </w:tblCellMar>
-        </w:tblPrEx>
         <w:trPr>
           <w:cantSplit/>
         </w:trPr>
@@ -20713,12 +19325,6 @@
         </w:tc>
       </w:tr>
       <w:tr>
-        <w:tblPrEx>
-          <w:tblCellMar>
-            <w:top w:w="0" w:type="dxa"/>
-            <w:bottom w:w="0" w:type="dxa"/>
-          </w:tblCellMar>
-        </w:tblPrEx>
         <w:trPr>
           <w:cantSplit/>
         </w:trPr>
@@ -20845,12 +19451,6 @@
         </w:tc>
       </w:tr>
       <w:tr>
-        <w:tblPrEx>
-          <w:tblCellMar>
-            <w:top w:w="0" w:type="dxa"/>
-            <w:bottom w:w="0" w:type="dxa"/>
-          </w:tblCellMar>
-        </w:tblPrEx>
         <w:trPr>
           <w:cantSplit/>
         </w:trPr>
@@ -20960,12 +19560,6 @@
         </w:tc>
       </w:tr>
       <w:tr>
-        <w:tblPrEx>
-          <w:tblCellMar>
-            <w:top w:w="0" w:type="dxa"/>
-            <w:bottom w:w="0" w:type="dxa"/>
-          </w:tblCellMar>
-        </w:tblPrEx>
         <w:trPr>
           <w:cantSplit/>
         </w:trPr>
@@ -21075,12 +19669,6 @@
         </w:tc>
       </w:tr>
       <w:tr>
-        <w:tblPrEx>
-          <w:tblCellMar>
-            <w:top w:w="0" w:type="dxa"/>
-            <w:bottom w:w="0" w:type="dxa"/>
-          </w:tblCellMar>
-        </w:tblPrEx>
         <w:trPr>
           <w:cantSplit/>
         </w:trPr>
@@ -21186,12 +19774,6 @@
         </w:tc>
       </w:tr>
       <w:tr>
-        <w:tblPrEx>
-          <w:tblCellMar>
-            <w:top w:w="0" w:type="dxa"/>
-            <w:bottom w:w="0" w:type="dxa"/>
-          </w:tblCellMar>
-        </w:tblPrEx>
         <w:trPr>
           <w:cantSplit/>
         </w:trPr>
@@ -21299,12 +19881,6 @@
         </w:tc>
       </w:tr>
       <w:tr>
-        <w:tblPrEx>
-          <w:tblCellMar>
-            <w:top w:w="0" w:type="dxa"/>
-            <w:bottom w:w="0" w:type="dxa"/>
-          </w:tblCellMar>
-        </w:tblPrEx>
         <w:trPr>
           <w:cantSplit/>
         </w:trPr>
@@ -21410,12 +19986,6 @@
         </w:tc>
       </w:tr>
       <w:tr>
-        <w:tblPrEx>
-          <w:tblCellMar>
-            <w:top w:w="0" w:type="dxa"/>
-            <w:bottom w:w="0" w:type="dxa"/>
-          </w:tblCellMar>
-        </w:tblPrEx>
         <w:trPr>
           <w:cantSplit/>
         </w:trPr>
@@ -21525,12 +20095,6 @@
         </w:tc>
       </w:tr>
       <w:tr>
-        <w:tblPrEx>
-          <w:tblCellMar>
-            <w:top w:w="0" w:type="dxa"/>
-            <w:bottom w:w="0" w:type="dxa"/>
-          </w:tblCellMar>
-        </w:tblPrEx>
         <w:trPr>
           <w:cantSplit/>
         </w:trPr>
@@ -21640,12 +20204,6 @@
         </w:tc>
       </w:tr>
       <w:tr>
-        <w:tblPrEx>
-          <w:tblCellMar>
-            <w:top w:w="0" w:type="dxa"/>
-            <w:bottom w:w="0" w:type="dxa"/>
-          </w:tblCellMar>
-        </w:tblPrEx>
         <w:trPr>
           <w:cantSplit/>
         </w:trPr>
@@ -21751,12 +20309,6 @@
         </w:tc>
       </w:tr>
       <w:tr>
-        <w:tblPrEx>
-          <w:tblCellMar>
-            <w:top w:w="0" w:type="dxa"/>
-            <w:bottom w:w="0" w:type="dxa"/>
-          </w:tblCellMar>
-        </w:tblPrEx>
         <w:trPr>
           <w:cantSplit/>
         </w:trPr>
@@ -21862,12 +20414,6 @@
         </w:tc>
       </w:tr>
       <w:tr>
-        <w:tblPrEx>
-          <w:tblCellMar>
-            <w:top w:w="0" w:type="dxa"/>
-            <w:bottom w:w="0" w:type="dxa"/>
-          </w:tblCellMar>
-        </w:tblPrEx>
         <w:trPr>
           <w:cantSplit/>
         </w:trPr>
@@ -21973,12 +20519,6 @@
         </w:tc>
       </w:tr>
       <w:tr>
-        <w:tblPrEx>
-          <w:tblCellMar>
-            <w:top w:w="0" w:type="dxa"/>
-            <w:bottom w:w="0" w:type="dxa"/>
-          </w:tblCellMar>
-        </w:tblPrEx>
         <w:trPr>
           <w:cantSplit/>
         </w:trPr>
@@ -22102,12 +20642,6 @@
         </w:tc>
       </w:tr>
       <w:tr>
-        <w:tblPrEx>
-          <w:tblCellMar>
-            <w:top w:w="0" w:type="dxa"/>
-            <w:bottom w:w="0" w:type="dxa"/>
-          </w:tblCellMar>
-        </w:tblPrEx>
         <w:trPr>
           <w:cantSplit/>
         </w:trPr>
@@ -22220,12 +20754,6 @@
         </w:tc>
       </w:tr>
       <w:tr>
-        <w:tblPrEx>
-          <w:tblCellMar>
-            <w:top w:w="0" w:type="dxa"/>
-            <w:bottom w:w="0" w:type="dxa"/>
-          </w:tblCellMar>
-        </w:tblPrEx>
         <w:trPr>
           <w:cantSplit/>
         </w:trPr>
@@ -22343,12 +20871,6 @@
         </w:tc>
       </w:tr>
       <w:tr>
-        <w:tblPrEx>
-          <w:tblCellMar>
-            <w:top w:w="0" w:type="dxa"/>
-            <w:bottom w:w="0" w:type="dxa"/>
-          </w:tblCellMar>
-        </w:tblPrEx>
         <w:trPr>
           <w:cantSplit/>
         </w:trPr>
@@ -22466,12 +20988,6 @@
         </w:tc>
       </w:tr>
       <w:tr>
-        <w:tblPrEx>
-          <w:tblCellMar>
-            <w:top w:w="0" w:type="dxa"/>
-            <w:bottom w:w="0" w:type="dxa"/>
-          </w:tblCellMar>
-        </w:tblPrEx>
         <w:trPr>
           <w:cantSplit/>
         </w:trPr>
@@ -22589,12 +21105,6 @@
         </w:tc>
       </w:tr>
       <w:tr>
-        <w:tblPrEx>
-          <w:tblCellMar>
-            <w:top w:w="0" w:type="dxa"/>
-            <w:bottom w:w="0" w:type="dxa"/>
-          </w:tblCellMar>
-        </w:tblPrEx>
         <w:trPr>
           <w:cantSplit/>
         </w:trPr>
@@ -22720,12 +21230,6 @@
         </w:tc>
       </w:tr>
       <w:tr>
-        <w:tblPrEx>
-          <w:tblCellMar>
-            <w:top w:w="0" w:type="dxa"/>
-            <w:bottom w:w="0" w:type="dxa"/>
-          </w:tblCellMar>
-        </w:tblPrEx>
         <w:trPr>
           <w:cantSplit/>
         </w:trPr>
@@ -22844,12 +21348,6 @@
         </w:tc>
       </w:tr>
       <w:tr>
-        <w:tblPrEx>
-          <w:tblCellMar>
-            <w:top w:w="0" w:type="dxa"/>
-            <w:bottom w:w="0" w:type="dxa"/>
-          </w:tblCellMar>
-        </w:tblPrEx>
         <w:trPr>
           <w:cantSplit/>
         </w:trPr>
@@ -22975,12 +21473,6 @@
         </w:tc>
       </w:tr>
       <w:tr>
-        <w:tblPrEx>
-          <w:tblCellMar>
-            <w:top w:w="0" w:type="dxa"/>
-            <w:bottom w:w="0" w:type="dxa"/>
-          </w:tblCellMar>
-        </w:tblPrEx>
         <w:trPr>
           <w:cantSplit/>
         </w:trPr>
@@ -23098,12 +21590,6 @@
         </w:tc>
       </w:tr>
       <w:tr>
-        <w:tblPrEx>
-          <w:tblCellMar>
-            <w:top w:w="0" w:type="dxa"/>
-            <w:bottom w:w="0" w:type="dxa"/>
-          </w:tblCellMar>
-        </w:tblPrEx>
         <w:trPr>
           <w:cantSplit/>
         </w:trPr>
@@ -23218,12 +21704,6 @@
         </w:tc>
       </w:tr>
       <w:tr>
-        <w:tblPrEx>
-          <w:tblCellMar>
-            <w:top w:w="0" w:type="dxa"/>
-            <w:bottom w:w="0" w:type="dxa"/>
-          </w:tblCellMar>
-        </w:tblPrEx>
         <w:trPr>
           <w:cantSplit/>
         </w:trPr>
@@ -23338,12 +21818,6 @@
         </w:tc>
       </w:tr>
       <w:tr>
-        <w:tblPrEx>
-          <w:tblCellMar>
-            <w:top w:w="0" w:type="dxa"/>
-            <w:bottom w:w="0" w:type="dxa"/>
-          </w:tblCellMar>
-        </w:tblPrEx>
         <w:trPr>
           <w:cantSplit/>
         </w:trPr>
@@ -23456,12 +21930,6 @@
         </w:tc>
       </w:tr>
       <w:tr>
-        <w:tblPrEx>
-          <w:tblCellMar>
-            <w:top w:w="0" w:type="dxa"/>
-            <w:bottom w:w="0" w:type="dxa"/>
-          </w:tblCellMar>
-        </w:tblPrEx>
         <w:trPr>
           <w:cantSplit/>
         </w:trPr>
@@ -23567,12 +22035,6 @@
         </w:tc>
       </w:tr>
       <w:tr>
-        <w:tblPrEx>
-          <w:tblCellMar>
-            <w:top w:w="0" w:type="dxa"/>
-            <w:bottom w:w="0" w:type="dxa"/>
-          </w:tblCellMar>
-        </w:tblPrEx>
         <w:trPr>
           <w:cantSplit/>
         </w:trPr>
@@ -23678,12 +22140,6 @@
         </w:tc>
       </w:tr>
       <w:tr>
-        <w:tblPrEx>
-          <w:tblCellMar>
-            <w:top w:w="0" w:type="dxa"/>
-            <w:bottom w:w="0" w:type="dxa"/>
-          </w:tblCellMar>
-        </w:tblPrEx>
         <w:trPr>
           <w:cantSplit/>
         </w:trPr>
@@ -23798,12 +22254,6 @@
         </w:tc>
       </w:tr>
       <w:tr>
-        <w:tblPrEx>
-          <w:tblCellMar>
-            <w:top w:w="0" w:type="dxa"/>
-            <w:bottom w:w="0" w:type="dxa"/>
-          </w:tblCellMar>
-        </w:tblPrEx>
         <w:trPr>
           <w:cantSplit/>
         </w:trPr>
@@ -23918,12 +22368,6 @@
         </w:tc>
       </w:tr>
       <w:tr>
-        <w:tblPrEx>
-          <w:tblCellMar>
-            <w:top w:w="0" w:type="dxa"/>
-            <w:bottom w:w="0" w:type="dxa"/>
-          </w:tblCellMar>
-        </w:tblPrEx>
         <w:trPr>
           <w:cantSplit/>
         </w:trPr>
@@ -24033,12 +22477,6 @@
         </w:tc>
       </w:tr>
       <w:tr>
-        <w:tblPrEx>
-          <w:tblCellMar>
-            <w:top w:w="0" w:type="dxa"/>
-            <w:bottom w:w="0" w:type="dxa"/>
-          </w:tblCellMar>
-        </w:tblPrEx>
         <w:trPr>
           <w:cantSplit/>
         </w:trPr>

</xml_diff>